<commit_message>
chore: actualizar manuales, backups y scripts de servidor
Co-Authored-By: Claude Sonnet 4.6 <noreply@anthropic.com>
</commit_message>
<xml_diff>
--- a/Manuales/Manual_Estudiante.docx
+++ b/Manuales/Manual_Estudiante.docx
@@ -2,10 +2,6 @@
 <file path=word/document.xml><?xml version="1.0" encoding="utf-8"?>
 <w:document xmlns:wpc="http://schemas.microsoft.com/office/word/2010/wordprocessingCanvas" xmlns:mo="http://schemas.microsoft.com/office/mac/office/2008/main" xmlns:mc="http://schemas.openxmlformats.org/markup-compatibility/2006" xmlns:mv="urn:schemas-microsoft-com:mac:vml" xmlns:o="urn:schemas-microsoft-com:office:office" xmlns:r="http://schemas.openxmlformats.org/officeDocument/2006/relationships" xmlns:m="http://schemas.openxmlformats.org/officeDocument/2006/math" xmlns:v="urn:schemas-microsoft-com:vml" xmlns:wp14="http://schemas.microsoft.com/office/word/2010/wordprocessingDrawing" xmlns:wp="http://schemas.openxmlformats.org/drawingml/2006/wordprocessingDrawing" xmlns:w10="urn:schemas-microsoft-com:office:word" xmlns:w="http://schemas.openxmlformats.org/wordprocessingml/2006/main" xmlns:w14="http://schemas.microsoft.com/office/word/2010/wordml" xmlns:wpg="http://schemas.microsoft.com/office/word/2010/wordprocessingGroup" xmlns:wpi="http://schemas.microsoft.com/office/word/2010/wordprocessingInk" xmlns:wne="http://schemas.microsoft.com/office/word/2006/wordml" xmlns:wps="http://schemas.microsoft.com/office/word/2010/wordprocessingShape" mc:Ignorable="w14 wp14">
   <w:body>
-    <w:p/>
-    <w:p/>
-    <w:p/>
-    <w:p/>
     <w:p>
       <w:pPr>
         <w:jc w:val="center"/>
@@ -25,7 +21,6 @@
       </w:pPr>
       <w:r>
         <w:rPr>
-          <w:color w:val="555555"/>
           <w:sz w:val="28"/>
         </w:rPr>
         <w:t>Sistema de Gestión de Proyectos de Grado</w:t>
@@ -39,8 +34,7 @@
       <w:r>
         <w:rPr>
           <w:b/>
-          <w:color w:val="1A1A1A"/>
-          <w:sz w:val="44"/>
+          <w:sz w:val="32"/>
         </w:rPr>
         <w:t>Manual de Usuario</w:t>
       </w:r>
@@ -51,13 +45,11 @@
       </w:pPr>
       <w:r>
         <w:rPr>
-          <w:color w:val="777777"/>
-          <w:sz w:val="26"/>
+          <w:sz w:val="28"/>
         </w:rPr>
         <w:t>Rol: Estudiante</w:t>
       </w:r>
     </w:p>
-    <w:p/>
     <w:p/>
     <w:p/>
     <w:p>
@@ -88,8 +80,7 @@
       </w:pPr>
       <w:r>
         <w:rPr>
-          <w:color w:val="0D6EFD"/>
-          <w:sz w:val="22"/>
+          <w:color w:val="C05A12"/>
         </w:rPr>
         <w:t>https://sistesis.site</w:t>
       </w:r>
@@ -113,7 +104,6 @@
     <w:p>
       <w:pPr>
         <w:pStyle w:val="ListBullet"/>
-        <w:ind w:left="720"/>
       </w:pPr>
       <w:r>
         <w:t>1. Introducción</w:t>
@@ -122,7 +112,6 @@
     <w:p>
       <w:pPr>
         <w:pStyle w:val="ListBullet"/>
-        <w:ind w:left="720"/>
       </w:pPr>
       <w:r>
         <w:t>2. Requisitos previos</w:t>
@@ -131,7 +120,6 @@
     <w:p>
       <w:pPr>
         <w:pStyle w:val="ListBullet"/>
-        <w:ind w:left="720"/>
       </w:pPr>
       <w:r>
         <w:t>3. Registro en el sistema</w:t>
@@ -140,7 +128,6 @@
     <w:p>
       <w:pPr>
         <w:pStyle w:val="ListBullet"/>
-        <w:ind w:left="720"/>
       </w:pPr>
       <w:r>
         <w:t>4. Inicio de sesión</w:t>
@@ -149,64 +136,65 @@
     <w:p>
       <w:pPr>
         <w:pStyle w:val="ListBullet"/>
-        <w:ind w:left="720"/>
       </w:pPr>
       <w:r>
-        <w:t>5. Panel principal (Dashboard)</w:t>
+        <w:t>5. Recuperar contraseña</w:t>
       </w:r>
     </w:p>
     <w:p>
       <w:pPr>
         <w:pStyle w:val="ListBullet"/>
-        <w:ind w:left="720"/>
       </w:pPr>
       <w:r>
-        <w:t>6. Registrar un proyecto de grado</w:t>
+        <w:t>6. Panel principal (Dashboard)</w:t>
       </w:r>
     </w:p>
     <w:p>
       <w:pPr>
         <w:pStyle w:val="ListBullet"/>
-        <w:ind w:left="720"/>
       </w:pPr>
       <w:r>
-        <w:t>7. Enviar proyecto a evaluación</w:t>
+        <w:t>7. Registrar un proyecto de grado</w:t>
       </w:r>
     </w:p>
     <w:p>
       <w:pPr>
         <w:pStyle w:val="ListBullet"/>
-        <w:ind w:left="720"/>
       </w:pPr>
       <w:r>
-        <w:t>8. Seguimiento del proyecto (Timeline)</w:t>
+        <w:t>8. Enviar proyecto a evaluación</w:t>
       </w:r>
     </w:p>
     <w:p>
       <w:pPr>
         <w:pStyle w:val="ListBullet"/>
-        <w:ind w:left="720"/>
       </w:pPr>
       <w:r>
-        <w:t>9. Enviar correcciones</w:t>
+        <w:t>9. Seguimiento del proyecto (Timeline)</w:t>
       </w:r>
     </w:p>
     <w:p>
       <w:pPr>
         <w:pStyle w:val="ListBullet"/>
-        <w:ind w:left="720"/>
       </w:pPr>
       <w:r>
-        <w:t>10. Firma de documentos</w:t>
+        <w:t>10. Enviar correcciones</w:t>
       </w:r>
     </w:p>
     <w:p>
       <w:pPr>
         <w:pStyle w:val="ListBullet"/>
-        <w:ind w:left="720"/>
       </w:pPr>
       <w:r>
-        <w:t>11. Preguntas frecuentes</w:t>
+        <w:t>11. Firma de documentos</w:t>
+      </w:r>
+    </w:p>
+    <w:p>
+      <w:pPr>
+        <w:pStyle w:val="ListBullet"/>
+      </w:pPr>
+      <w:r>
+        <w:t>12. Preguntas frecuentes</w:t>
       </w:r>
     </w:p>
     <w:p>
@@ -226,25 +214,29 @@
       </w:r>
     </w:p>
     <w:p>
+      <w:pPr/>
       <w:r>
-        <w:rPr>
-          <w:b w:val="0"/>
-        </w:rPr>
-        <w:t>SisTesis es el Sistema de Gestión de Proyectos de Grado de la Facultad de Ingeniería de la Universidad de San Buenaventura – Cali. Este manual describe el uso de la plataforma desde el rol de Estudiante.</w:t>
+        <w:t>SisTesis es el Sistema de Gestión de Proyectos de Grado de la Facultad de Ingeniería de la Universidad de San Buenaventura – Cali, disponible en https://sistesis.site. Permite gestionar todo el ciclo de vida del trabajo de grado desde el registro hasta la firma del acta de sustentación.</w:t>
       </w:r>
     </w:p>
+    <w:p/>
     <w:p>
+      <w:pPr/>
       <w:r>
-        <w:rPr>
-          <w:b w:val="0"/>
-        </w:rPr>
         <w:t>Como estudiante, usted podrá:</w:t>
       </w:r>
     </w:p>
     <w:p>
       <w:pPr>
         <w:pStyle w:val="ListBullet"/>
-        <w:ind w:left="720"/>
+      </w:pPr>
+      <w:r>
+        <w:t>Crear su cuenta de estudiante de forma autónoma.</w:t>
+      </w:r>
+    </w:p>
+    <w:p>
+      <w:pPr>
+        <w:pStyle w:val="ListBullet"/>
       </w:pPr>
       <w:r>
         <w:t>Registrar su proyecto de grado con toda la información requerida.</w:t>
@@ -253,7 +245,6 @@
     <w:p>
       <w:pPr>
         <w:pStyle w:val="ListBullet"/>
-        <w:ind w:left="720"/>
       </w:pPr>
       <w:r>
         <w:t>Subir el documento de tesis y archivos complementarios.</w:t>
@@ -262,7 +253,6 @@
     <w:p>
       <w:pPr>
         <w:pStyle w:val="ListBullet"/>
-        <w:ind w:left="720"/>
       </w:pPr>
       <w:r>
         <w:t>Enviar el proyecto para evaluación académica.</w:t>
@@ -271,16 +261,14 @@
     <w:p>
       <w:pPr>
         <w:pStyle w:val="ListBullet"/>
-        <w:ind w:left="720"/>
       </w:pPr>
       <w:r>
-        <w:t>Hacer seguimiento del progreso de su proyecto en tiempo real.</w:t>
+        <w:t>Hacer seguimiento en tiempo real a través de la línea de tiempo (Timeline).</w:t>
       </w:r>
     </w:p>
     <w:p>
       <w:pPr>
         <w:pStyle w:val="ListBullet"/>
-        <w:ind w:left="720"/>
       </w:pPr>
       <w:r>
         <w:t>Enviar correcciones cuando sean solicitadas por los evaluadores.</w:t>
@@ -289,10 +277,17 @@
     <w:p>
       <w:pPr>
         <w:pStyle w:val="ListBullet"/>
-        <w:ind w:left="720"/>
       </w:pPr>
       <w:r>
         <w:t>Firmar el acta de sustentación de forma digital.</w:t>
+      </w:r>
+    </w:p>
+    <w:p>
+      <w:pPr>
+        <w:pStyle w:val="ListBullet"/>
+      </w:pPr>
+      <w:r>
+        <w:t>Recuperar su contraseña de forma autónoma si la olvidó.</w:t>
       </w:r>
     </w:p>
     <w:p>
@@ -314,7 +309,6 @@
     <w:p>
       <w:pPr>
         <w:pStyle w:val="ListBullet"/>
-        <w:ind w:left="720"/>
       </w:pPr>
       <w:r>
         <w:t>Navegador web actualizado (Google Chrome, Firefox, Edge o Safari).</w:t>
@@ -323,7 +317,6 @@
     <w:p>
       <w:pPr>
         <w:pStyle w:val="ListBullet"/>
-        <w:ind w:left="720"/>
       </w:pPr>
       <w:r>
         <w:t>Correo electrónico institucional activo (@usbcali.edu.co).</w:t>
@@ -332,7 +325,22 @@
     <w:p>
       <w:pPr>
         <w:pStyle w:val="ListBullet"/>
-        <w:ind w:left="720"/>
+      </w:pPr>
+      <w:r>
+        <w:t>Código de estudiante (ejemplo: 30000088712).</w:t>
+      </w:r>
+    </w:p>
+    <w:p>
+      <w:pPr>
+        <w:pStyle w:val="ListBullet"/>
+      </w:pPr>
+      <w:r>
+        <w:t>Número de cédula de ciudadanía.</w:t>
+      </w:r>
+    </w:p>
+    <w:p>
+      <w:pPr>
+        <w:pStyle w:val="ListBullet"/>
       </w:pPr>
       <w:r>
         <w:t>Documento de tesis en formato PDF o DOCX (máximo 100 MB).</w:t>
@@ -341,24 +349,18 @@
     <w:p>
       <w:pPr>
         <w:pStyle w:val="ListBullet"/>
-        <w:ind w:left="720"/>
       </w:pPr>
       <w:r>
         <w:t>Conexión a internet estable.</w:t>
       </w:r>
     </w:p>
+    <w:p/>
     <w:p>
-      <w:r>
-        <w:rPr>
-          <w:b w:val="0"/>
-        </w:rPr>
-      </w:r>
-    </w:p>
-    <w:p>
+      <w:pPr/>
       <w:r>
         <w:rPr>
           <w:i/>
-          <w:color w:val="0D6EFD"/>
+          <w:color w:val="444488"/>
         </w:rPr>
         <w:t>ℹ️  Acceda al sistema en: https://sistesis.site</w:t>
       </w:r>
@@ -380,37 +382,40 @@
       </w:r>
     </w:p>
     <w:p>
+      <w:pPr/>
       <w:r>
-        <w:rPr>
-          <w:b w:val="0"/>
-        </w:rPr>
-        <w:t>Si es la primera vez que utiliza SisTesis, debe crear una cuenta de estudiante.</w:t>
+        <w:t>Si es la primera vez que utiliza SisTesis, debe crear una cuenta de estudiante. El registro es gratuito y no requiere contraseña inicial: el sistema genera una contraseña y la envía a su correo institucional.</w:t>
       </w:r>
     </w:p>
+    <w:p/>
     <w:p>
       <w:pPr>
         <w:pStyle w:val="Heading2"/>
       </w:pPr>
       <w:r>
-        <w:rPr>
-          <w:color w:val="333333"/>
-        </w:rPr>
         <w:t>Pasos para registrarse</w:t>
       </w:r>
     </w:p>
     <w:p>
       <w:pPr>
         <w:pStyle w:val="ListNumber"/>
-        <w:ind w:left="720"/>
       </w:pPr>
       <w:r>
-        <w:t>Ingrese a https://sistesis.site/register/student en su navegador.</w:t>
+        <w:t xml:space="preserve">Ingrese a </w:t>
+      </w:r>
+      <w:r>
+        <w:rPr>
+          <w:color w:val="C05A12"/>
+        </w:rPr>
+        <w:t>https://sistesis.site/register/student</w:t>
+      </w:r>
+      <w:r>
+        <w:t xml:space="preserve"> en su navegador.</w:t>
       </w:r>
     </w:p>
     <w:p>
       <w:pPr>
         <w:pStyle w:val="ListNumber"/>
-        <w:ind w:left="720"/>
       </w:pPr>
       <w:r>
         <w:t>Complete el formulario con los siguientes datos:</w:t>
@@ -419,52 +424,38 @@
     <w:p>
       <w:pPr>
         <w:pStyle w:val="ListBullet"/>
-        <w:ind w:left="1440"/>
       </w:pPr>
       <w:r>
-        <w:t>Nombre completo</w:t>
+        <w:t>Nombre y Apellidos completos (en mayúsculas, exactamente como aparece en su documento de identidad).</w:t>
       </w:r>
     </w:p>
     <w:p>
       <w:pPr>
         <w:pStyle w:val="ListBullet"/>
-        <w:ind w:left="1440"/>
       </w:pPr>
       <w:r>
-        <w:t>Código de estudiante</w:t>
+        <w:t>Código estudiantil (número de matrícula, ej: 30000088712).</w:t>
       </w:r>
     </w:p>
     <w:p>
       <w:pPr>
         <w:pStyle w:val="ListBullet"/>
-        <w:ind w:left="1440"/>
       </w:pPr>
       <w:r>
-        <w:t>Cédula de ciudadanía</w:t>
+        <w:t>Número de cédula de ciudadanía.</w:t>
       </w:r>
     </w:p>
     <w:p>
       <w:pPr>
         <w:pStyle w:val="ListBullet"/>
-        <w:ind w:left="1440"/>
       </w:pPr>
       <w:r>
-        <w:t>Correo electrónico institucional</w:t>
+        <w:t>Correo electrónico institucional (@usbcali.edu.co).</w:t>
       </w:r>
     </w:p>
     <w:p>
       <w:pPr>
-        <w:pStyle w:val="ListBullet"/>
-        <w:ind w:left="1440"/>
-      </w:pPr>
-      <w:r>
-        <w:t>Contraseña (mínimo 6 caracteres)</w:t>
-      </w:r>
-    </w:p>
-    <w:p>
-      <w:pPr>
         <w:pStyle w:val="ListNumber"/>
-        <w:ind w:left="720"/>
       </w:pPr>
       <w:r>
         <w:t>Haga clic en el botón "Registrarse".</w:t>
@@ -473,26 +464,38 @@
     <w:p>
       <w:pPr>
         <w:pStyle w:val="ListNumber"/>
-        <w:ind w:left="720"/>
       </w:pPr>
       <w:r>
-        <w:t>Recibirá un correo de confirmación con sus credenciales.</w:t>
+        <w:t>Recibirá un correo de bienvenida con su usuario y contraseña temporal. Si no lo encuentra en la bandeja de entrada, revise la carpeta de spam.</w:t>
       </w:r>
     </w:p>
     <w:p>
+      <w:pPr>
+        <w:pStyle w:val="ListNumber"/>
+      </w:pPr>
+      <w:r>
+        <w:t>Ingrese al sistema con las credenciales recibidas.</w:t>
+      </w:r>
+    </w:p>
+    <w:p/>
+    <w:p>
+      <w:pPr/>
       <w:r>
         <w:rPr>
-          <w:b w:val="0"/>
+          <w:i/>
+          <w:color w:val="444488"/>
         </w:rPr>
+        <w:t>⚠️  Use siempre su correo institucional (@usbcali.edu.co). El sistema puede rechazar correos personales.</w:t>
       </w:r>
     </w:p>
     <w:p>
+      <w:pPr/>
       <w:r>
         <w:rPr>
           <w:i/>
-          <w:color w:val="CC6600"/>
+          <w:color w:val="444488"/>
         </w:rPr>
-        <w:t>⚠️  Use su correo institucional. El sistema puede rechazar correos personales.</w:t>
+        <w:t>ℹ️  No es necesario que ingrese una contraseña al registrarse. El sistema genera una automáticamente y la envía a su correo.</w:t>
       </w:r>
     </w:p>
     <w:p>
@@ -514,7 +517,6 @@
     <w:p>
       <w:pPr>
         <w:pStyle w:val="ListNumber"/>
-        <w:ind w:left="720"/>
       </w:pPr>
       <w:r>
         <w:t>Ingrese a https://sistesis.site/login/student.</w:t>
@@ -523,44 +525,68 @@
     <w:p>
       <w:pPr>
         <w:pStyle w:val="ListNumber"/>
-        <w:ind w:left="720"/>
       </w:pPr>
       <w:r>
-        <w:t>Escriba su correo institucional (o código/cédula) y contraseña.</w:t>
+        <w:t>En el campo "Correo/Código/Cédula" puede escribir cualquiera de los siguientes:</w:t>
       </w:r>
     </w:p>
     <w:p>
       <w:pPr>
-        <w:pStyle w:val="ListNumber"/>
-        <w:ind w:left="720"/>
+        <w:pStyle w:val="ListBullet"/>
       </w:pPr>
       <w:r>
-        <w:t>Haga clic en "Iniciar sesión".</w:t>
+        <w:t>Su correo institucional (ej: jdmartinez@usbcali.edu.co).</w:t>
       </w:r>
     </w:p>
     <w:p>
       <w:pPr>
+        <w:pStyle w:val="ListBullet"/>
+      </w:pPr>
+      <w:r>
+        <w:t>Su código estudiantil (ej: 30000088712).</w:t>
+      </w:r>
+    </w:p>
+    <w:p>
+      <w:pPr>
+        <w:pStyle w:val="ListBullet"/>
+      </w:pPr>
+      <w:r>
+        <w:t>Su número de cédula.</w:t>
+      </w:r>
+    </w:p>
+    <w:p>
+      <w:pPr>
         <w:pStyle w:val="ListNumber"/>
-        <w:ind w:left="720"/>
+      </w:pPr>
+      <w:r>
+        <w:t>Escriba su contraseña.</w:t>
+      </w:r>
+    </w:p>
+    <w:p>
+      <w:pPr>
+        <w:pStyle w:val="ListNumber"/>
+      </w:pPr>
+      <w:r>
+        <w:t>Haga clic en "Ingresar".</w:t>
+      </w:r>
+    </w:p>
+    <w:p>
+      <w:pPr>
+        <w:pStyle w:val="ListNumber"/>
       </w:pPr>
       <w:r>
         <w:t>Será redirigido al panel principal del estudiante.</w:t>
       </w:r>
     </w:p>
+    <w:p/>
     <w:p>
-      <w:r>
-        <w:rPr>
-          <w:b w:val="0"/>
-        </w:rPr>
-      </w:r>
-    </w:p>
-    <w:p>
+      <w:pPr/>
       <w:r>
         <w:rPr>
           <w:i/>
-          <w:color w:val="0D6EFD"/>
+          <w:color w:val="444488"/>
         </w:rPr>
-        <w:t>ℹ️  Si olvidó su contraseña, contacte al administrador del programa para que le envíe nuevas credenciales.</w:t>
+        <w:t>ℹ️  Si olvidó su contraseña, use el botón "¿Olvidaste tu contraseña?" que aparece debajo del botón Ingresar. Consulte la sección 5 de este manual.</w:t>
       </w:r>
     </w:p>
     <w:p>
@@ -576,70 +602,162 @@
         <w:rPr>
           <w:color w:val="C05A12"/>
         </w:rPr>
-        <w:t>5. Panel principal (Dashboard)</w:t>
+        <w:t>5. Recuperar contraseña</w:t>
+      </w:r>
+    </w:p>
+    <w:p>
+      <w:pPr/>
+      <w:r>
+        <w:t>Si olvidó su contraseña, el sistema le permite recuperarla de forma autónoma sin necesidad de contactar al administrador.</w:t>
+      </w:r>
+    </w:p>
+    <w:p/>
+    <w:p>
+      <w:pPr>
+        <w:pStyle w:val="Heading2"/>
+      </w:pPr>
+      <w:r>
+        <w:t>Pasos para recuperar la contraseña</w:t>
+      </w:r>
+    </w:p>
+    <w:p>
+      <w:pPr>
+        <w:pStyle w:val="ListNumber"/>
+      </w:pPr>
+      <w:r>
+        <w:t>Ingrese a https://sistesis.site/login/student.</w:t>
+      </w:r>
+    </w:p>
+    <w:p>
+      <w:pPr>
+        <w:pStyle w:val="ListNumber"/>
+      </w:pPr>
+      <w:r>
+        <w:t>Haga clic en el enlace "¿Olvidaste tu contraseña?" (aparece debajo del botón Ingresar).</w:t>
+      </w:r>
+    </w:p>
+    <w:p>
+      <w:pPr>
+        <w:pStyle w:val="ListNumber"/>
+      </w:pPr>
+      <w:r>
+        <w:t>Se abrirá una ventana emergente (modal). Complete los campos:</w:t>
+      </w:r>
+    </w:p>
+    <w:p>
+      <w:pPr>
+        <w:pStyle w:val="ListBullet"/>
+      </w:pPr>
+      <w:r>
+        <w:t>Cédula: su número de cédula de ciudadanía.</w:t>
+      </w:r>
+    </w:p>
+    <w:p>
+      <w:pPr>
+        <w:pStyle w:val="ListBullet"/>
+      </w:pPr>
+      <w:r>
+        <w:t>Correo institucional: su correo @usbcali.edu.co registrado.</w:t>
+      </w:r>
+    </w:p>
+    <w:p>
+      <w:pPr>
+        <w:pStyle w:val="ListNumber"/>
+      </w:pPr>
+      <w:r>
+        <w:t>Haga clic en "Enviar".</w:t>
+      </w:r>
+    </w:p>
+    <w:p>
+      <w:pPr>
+        <w:pStyle w:val="ListNumber"/>
+      </w:pPr>
+      <w:r>
+        <w:t>Si los datos coinciden con un usuario registrado, recibirá un correo con su usuario y una nueva contraseña. El sistema mostrará su nombre completo en la pantalla de confirmación.</w:t>
+      </w:r>
+    </w:p>
+    <w:p>
+      <w:pPr>
+        <w:pStyle w:val="ListNumber"/>
+      </w:pPr>
+      <w:r>
+        <w:t>Revise su bandeja de entrada. Si no llega, revise la carpeta de spam o correo no deseado.</w:t>
+      </w:r>
+    </w:p>
+    <w:p>
+      <w:pPr>
+        <w:pStyle w:val="ListNumber"/>
+      </w:pPr>
+      <w:r>
+        <w:t>Ingrese al sistema con la nueva contraseña recibida.</w:t>
+      </w:r>
+    </w:p>
+    <w:p/>
+    <w:p>
+      <w:pPr/>
+      <w:r>
+        <w:rPr>
+          <w:i/>
+          <w:color w:val="444488"/>
+        </w:rPr>
+        <w:t>ℹ️  Por seguridad, se recomienda cambiar la contraseña después de ingresar con la contraseña recuperada. Diríjase a su perfil (icono de usuario) → 'Cambiar contraseña'.</w:t>
+      </w:r>
+    </w:p>
+    <w:p>
+      <w:pPr/>
+      <w:r>
+        <w:rPr>
+          <w:i/>
+          <w:color w:val="444488"/>
+        </w:rPr>
+        <w:t>⚠️  Si ingresa datos incorrectos, el sistema no indicará si el usuario existe o no. Esto es por seguridad. Verifique que su cédula y correo sean los registrados al momento de crear su cuenta.</w:t>
       </w:r>
     </w:p>
     <w:p>
       <w:r>
-        <w:rPr>
-          <w:b w:val="0"/>
-        </w:rPr>
-        <w:t>Al iniciar sesión, verá el panel principal del estudiante. Desde aquí puede:</w:t>
+        <w:br w:type="page"/>
       </w:r>
     </w:p>
     <w:p>
       <w:pPr>
-        <w:pStyle w:val="ListBullet"/>
-        <w:ind w:left="720"/>
+        <w:pStyle w:val="Heading1"/>
       </w:pPr>
       <w:r>
-        <w:t>Ver el estado actual de su proyecto de grado.</w:t>
+        <w:rPr>
+          <w:color w:val="C05A12"/>
+        </w:rPr>
+        <w:t>6. Panel principal (Dashboard)</w:t>
       </w:r>
     </w:p>
     <w:p>
-      <w:pPr>
-        <w:pStyle w:val="ListBullet"/>
-        <w:ind w:left="720"/>
-      </w:pPr>
+      <w:pPr/>
       <w:r>
-        <w:t>Acceder a las acciones disponibles según el estado del proyecto.</w:t>
+        <w:t>Al iniciar sesión, verá el panel principal. Desde aquí puede consultar el estado de su proyecto de grado y acceder a las acciones disponibles.</w:t>
       </w:r>
     </w:p>
+    <w:p/>
     <w:p>
       <w:pPr>
-        <w:pStyle w:val="ListBullet"/>
-        <w:ind w:left="720"/>
+        <w:pStyle w:val="Heading2"/>
       </w:pPr>
       <w:r>
-        <w:t>Navegar al timeline (línea de tiempo) del proyecto.</w:t>
-      </w:r>
-    </w:p>
-    <w:p>
-      <w:pPr>
-        <w:pStyle w:val="Heading2"/>
-      </w:pPr>
-      <w:r>
-        <w:rPr>
-          <w:color w:val="333333"/>
-        </w:rPr>
-        <w:t>Información mostrada</w:t>
+        <w:t>Información mostrada en el panel</w:t>
       </w:r>
     </w:p>
     <w:tbl>
       <w:tblPr>
-        <w:tblStyle w:val="LightShading-Accent1"/>
+        <w:tblStyle w:val="TableGrid"/>
         <w:tblW w:type="auto" w:w="0"/>
-        <w:jc w:val="center"/>
         <w:tblLook w:firstColumn="1" w:firstRow="1" w:lastColumn="0" w:lastRow="0" w:noHBand="0" w:noVBand="1" w:val="04A0"/>
       </w:tblPr>
       <w:tblGrid>
-        <w:gridCol w:w="4703"/>
-        <w:gridCol w:w="4703"/>
+        <w:gridCol w:w="4680"/>
+        <w:gridCol w:w="4680"/>
       </w:tblGrid>
       <w:tr>
         <w:tc>
           <w:tcPr>
-            <w:tcW w:type="dxa" w:w="4703"/>
+            <w:tcW w:type="dxa" w:w="4680"/>
           </w:tcPr>
           <w:p>
             <w:r>
@@ -652,7 +770,7 @@
         </w:tc>
         <w:tc>
           <w:tcPr>
-            <w:tcW w:type="dxa" w:w="4703"/>
+            <w:tcW w:type="dxa" w:w="4680"/>
           </w:tcPr>
           <w:p>
             <w:r>
@@ -667,7 +785,7 @@
       <w:tr>
         <w:tc>
           <w:tcPr>
-            <w:tcW w:type="dxa" w:w="4703"/>
+            <w:tcW w:type="dxa" w:w="4680"/>
           </w:tcPr>
           <w:p>
             <w:r>
@@ -677,7 +795,7 @@
         </w:tc>
         <w:tc>
           <w:tcPr>
-            <w:tcW w:type="dxa" w:w="4703"/>
+            <w:tcW w:type="dxa" w:w="4680"/>
           </w:tcPr>
           <w:p>
             <w:r>
@@ -689,7 +807,7 @@
       <w:tr>
         <w:tc>
           <w:tcPr>
-            <w:tcW w:type="dxa" w:w="4703"/>
+            <w:tcW w:type="dxa" w:w="4680"/>
           </w:tcPr>
           <w:p>
             <w:r>
@@ -699,11 +817,11 @@
         </w:tc>
         <w:tc>
           <w:tcPr>
-            <w:tcW w:type="dxa" w:w="4703"/>
+            <w:tcW w:type="dxa" w:w="4680"/>
           </w:tcPr>
           <w:p>
             <w:r>
-              <w:t>Nombre(s) del o los autores</w:t>
+              <w:t>Nombre(s) del autor o los autores</w:t>
             </w:r>
           </w:p>
         </w:tc>
@@ -711,7 +829,7 @@
       <w:tr>
         <w:tc>
           <w:tcPr>
-            <w:tcW w:type="dxa" w:w="4703"/>
+            <w:tcW w:type="dxa" w:w="4680"/>
           </w:tcPr>
           <w:p>
             <w:r>
@@ -721,11 +839,11 @@
         </w:tc>
         <w:tc>
           <w:tcPr>
-            <w:tcW w:type="dxa" w:w="4703"/>
+            <w:tcW w:type="dxa" w:w="4680"/>
           </w:tcPr>
           <w:p>
             <w:r>
-              <w:t>Estado actual del proyecto (borrador, enviado, en evaluación, etc.)</w:t>
+              <w:t>Estado actual: Borrador, Enviado, En evaluación, etc.</w:t>
             </w:r>
           </w:p>
         </w:tc>
@@ -733,7 +851,29 @@
       <w:tr>
         <w:tc>
           <w:tcPr>
-            <w:tcW w:type="dxa" w:w="4703"/>
+            <w:tcW w:type="dxa" w:w="4680"/>
+          </w:tcPr>
+          <w:p>
+            <w:r>
+              <w:t>Ronda de revisión</w:t>
+            </w:r>
+          </w:p>
+        </w:tc>
+        <w:tc>
+          <w:tcPr>
+            <w:tcW w:type="dxa" w:w="4680"/>
+          </w:tcPr>
+          <w:p>
+            <w:r>
+              <w:t>Número de ronda de correcciones (si aplica)</w:t>
+            </w:r>
+          </w:p>
+        </w:tc>
+      </w:tr>
+      <w:tr>
+        <w:tc>
+          <w:tcPr>
+            <w:tcW w:type="dxa" w:w="4680"/>
           </w:tcPr>
           <w:p>
             <w:r>
@@ -743,7 +883,7 @@
         </w:tc>
         <w:tc>
           <w:tcPr>
-            <w:tcW w:type="dxa" w:w="4703"/>
+            <w:tcW w:type="dxa" w:w="4680"/>
           </w:tcPr>
           <w:p>
             <w:r>
@@ -755,7 +895,7 @@
       <w:tr>
         <w:tc>
           <w:tcPr>
-            <w:tcW w:type="dxa" w:w="4703"/>
+            <w:tcW w:type="dxa" w:w="4680"/>
           </w:tcPr>
           <w:p>
             <w:r>
@@ -765,11 +905,11 @@
         </w:tc>
         <w:tc>
           <w:tcPr>
-            <w:tcW w:type="dxa" w:w="4703"/>
+            <w:tcW w:type="dxa" w:w="4680"/>
           </w:tcPr>
           <w:p>
             <w:r>
-              <w:t>Nombre de los evaluadores asignados (si aplica)</w:t>
+              <w:t>Nombres de los evaluadores asignados (si aplica)</w:t>
             </w:r>
           </w:p>
         </w:tc>
@@ -781,16 +921,12 @@
         <w:pStyle w:val="Heading2"/>
       </w:pPr>
       <w:r>
-        <w:rPr>
-          <w:color w:val="333333"/>
-        </w:rPr>
         <w:t>Acciones disponibles (estado Borrador)</w:t>
       </w:r>
     </w:p>
     <w:p>
       <w:pPr>
         <w:pStyle w:val="ListBullet"/>
-        <w:ind w:left="720"/>
       </w:pPr>
       <w:r>
         <w:t>Enviar a evaluar: Envía el proyecto al administrador para revisión.</w:t>
@@ -799,33 +935,26 @@
     <w:p>
       <w:pPr>
         <w:pStyle w:val="ListBullet"/>
-        <w:ind w:left="720"/>
       </w:pPr>
       <w:r>
-        <w:t>Modificar: Permite editar los datos del proyecto.</w:t>
+        <w:t>Modificar: Permite editar todos los datos del proyecto.</w:t>
       </w:r>
     </w:p>
     <w:p>
       <w:pPr>
         <w:pStyle w:val="ListBullet"/>
-        <w:ind w:left="720"/>
       </w:pPr>
       <w:r>
-        <w:t>Eliminar proyecto de grado: Elimina permanentemente el proyecto.</w:t>
+        <w:t>Eliminar proyecto de grado: Elimina permanentemente el proyecto (no reversible).</w:t>
       </w:r>
     </w:p>
+    <w:p/>
     <w:p>
-      <w:r>
-        <w:rPr>
-          <w:b w:val="0"/>
-        </w:rPr>
-      </w:r>
-    </w:p>
-    <w:p>
+      <w:pPr/>
       <w:r>
         <w:rPr>
           <w:i/>
-          <w:color w:val="CC6600"/>
+          <w:color w:val="444488"/>
         </w:rPr>
         <w:t>⚠️  Una vez enviado a evaluar, no podrá modificar ni eliminar el proyecto.</w:t>
       </w:r>
@@ -843,32 +972,27 @@
         <w:rPr>
           <w:color w:val="C05A12"/>
         </w:rPr>
-        <w:t>6. Registrar un proyecto de grado</w:t>
+        <w:t>7. Registrar un proyecto de grado</w:t>
       </w:r>
     </w:p>
     <w:p>
+      <w:pPr/>
       <w:r>
-        <w:rPr>
-          <w:b w:val="0"/>
-        </w:rPr>
         <w:t>Para crear un nuevo proyecto de grado, siga estos pasos:</w:t>
       </w:r>
     </w:p>
+    <w:p/>
     <w:p>
       <w:pPr>
         <w:pStyle w:val="Heading2"/>
       </w:pPr>
       <w:r>
-        <w:rPr>
-          <w:color w:val="333333"/>
-        </w:rPr>
         <w:t>Paso a paso</w:t>
       </w:r>
     </w:p>
     <w:p>
       <w:pPr>
         <w:pStyle w:val="ListNumber"/>
-        <w:ind w:left="720"/>
       </w:pPr>
       <w:r>
         <w:t>En el panel principal, haga clic en "Registrar nuevo proyecto de grado".</w:t>
@@ -877,35 +1001,35 @@
     <w:p>
       <w:pPr>
         <w:pStyle w:val="ListNumber"/>
-        <w:ind w:left="720"/>
       </w:pPr>
       <w:r>
         <w:t>Complete el formulario con la siguiente información:</w:t>
       </w:r>
     </w:p>
+    <w:p/>
     <w:p>
+      <w:pPr>
+        <w:pStyle w:val="Heading2"/>
+      </w:pPr>
       <w:r>
-        <w:rPr>
-          <w:b w:val="0"/>
-        </w:rPr>
+        <w:t>Campos del formulario</w:t>
       </w:r>
     </w:p>
     <w:tbl>
       <w:tblPr>
-        <w:tblStyle w:val="LightShading-Accent1"/>
+        <w:tblStyle w:val="TableGrid"/>
         <w:tblW w:type="auto" w:w="0"/>
-        <w:jc w:val="center"/>
         <w:tblLook w:firstColumn="1" w:firstRow="1" w:lastColumn="0" w:lastRow="0" w:noHBand="0" w:noVBand="1" w:val="04A0"/>
       </w:tblPr>
       <w:tblGrid>
-        <w:gridCol w:w="3135"/>
-        <w:gridCol w:w="3135"/>
-        <w:gridCol w:w="3135"/>
+        <w:gridCol w:w="3120"/>
+        <w:gridCol w:w="3120"/>
+        <w:gridCol w:w="3120"/>
       </w:tblGrid>
       <w:tr>
         <w:tc>
           <w:tcPr>
-            <w:tcW w:type="dxa" w:w="3135"/>
+            <w:tcW w:type="dxa" w:w="3120"/>
           </w:tcPr>
           <w:p>
             <w:r>
@@ -918,7 +1042,7 @@
         </w:tc>
         <w:tc>
           <w:tcPr>
-            <w:tcW w:type="dxa" w:w="3135"/>
+            <w:tcW w:type="dxa" w:w="3120"/>
           </w:tcPr>
           <w:p>
             <w:r>
@@ -931,7 +1055,7 @@
         </w:tc>
         <w:tc>
           <w:tcPr>
-            <w:tcW w:type="dxa" w:w="3135"/>
+            <w:tcW w:type="dxa" w:w="3120"/>
           </w:tcPr>
           <w:p>
             <w:r>
@@ -946,7 +1070,7 @@
       <w:tr>
         <w:tc>
           <w:tcPr>
-            <w:tcW w:type="dxa" w:w="3135"/>
+            <w:tcW w:type="dxa" w:w="3120"/>
           </w:tcPr>
           <w:p>
             <w:r>
@@ -956,7 +1080,7 @@
         </w:tc>
         <w:tc>
           <w:tcPr>
-            <w:tcW w:type="dxa" w:w="3135"/>
+            <w:tcW w:type="dxa" w:w="3120"/>
           </w:tcPr>
           <w:p>
             <w:r>
@@ -966,11 +1090,11 @@
         </w:tc>
         <w:tc>
           <w:tcPr>
-            <w:tcW w:type="dxa" w:w="3135"/>
+            <w:tcW w:type="dxa" w:w="3120"/>
           </w:tcPr>
           <w:p>
             <w:r>
-              <w:t>Nombre completo del proyecto de grado</w:t>
+              <w:t>Nombre completo del proyecto de grado.</w:t>
             </w:r>
           </w:p>
         </w:tc>
@@ -978,7 +1102,7 @@
       <w:tr>
         <w:tc>
           <w:tcPr>
-            <w:tcW w:type="dxa" w:w="3135"/>
+            <w:tcW w:type="dxa" w:w="3120"/>
           </w:tcPr>
           <w:p>
             <w:r>
@@ -988,7 +1112,7 @@
         </w:tc>
         <w:tc>
           <w:tcPr>
-            <w:tcW w:type="dxa" w:w="3135"/>
+            <w:tcW w:type="dxa" w:w="3120"/>
           </w:tcPr>
           <w:p>
             <w:r>
@@ -998,11 +1122,11 @@
         </w:tc>
         <w:tc>
           <w:tcPr>
-            <w:tcW w:type="dxa" w:w="3135"/>
+            <w:tcW w:type="dxa" w:w="3120"/>
           </w:tcPr>
           <w:p>
             <w:r>
-              <w:t>Descripción resumida del proyecto</w:t>
+              <w:t>Descripción breve del proyecto (propósito, metodología, resultados esperados).</w:t>
             </w:r>
           </w:p>
         </w:tc>
@@ -1010,7 +1134,7 @@
       <w:tr>
         <w:tc>
           <w:tcPr>
-            <w:tcW w:type="dxa" w:w="3135"/>
+            <w:tcW w:type="dxa" w:w="3120"/>
           </w:tcPr>
           <w:p>
             <w:r>
@@ -1020,7 +1144,7 @@
         </w:tc>
         <w:tc>
           <w:tcPr>
-            <w:tcW w:type="dxa" w:w="3135"/>
+            <w:tcW w:type="dxa" w:w="3120"/>
           </w:tcPr>
           <w:p>
             <w:r>
@@ -1030,11 +1154,11 @@
         </w:tc>
         <w:tc>
           <w:tcPr>
-            <w:tcW w:type="dxa" w:w="3135"/>
+            <w:tcW w:type="dxa" w:w="3120"/>
           </w:tcPr>
           <w:p>
             <w:r>
-              <w:t>Términos clave de investigación separados por coma</w:t>
+              <w:t>Términos clave separados por coma (ej: machine learning, redes neuronales).</w:t>
             </w:r>
           </w:p>
         </w:tc>
@@ -1042,7 +1166,7 @@
       <w:tr>
         <w:tc>
           <w:tcPr>
-            <w:tcW w:type="dxa" w:w="3135"/>
+            <w:tcW w:type="dxa" w:w="3120"/>
           </w:tcPr>
           <w:p>
             <w:r>
@@ -1052,7 +1176,7 @@
         </w:tc>
         <w:tc>
           <w:tcPr>
-            <w:tcW w:type="dxa" w:w="3135"/>
+            <w:tcW w:type="dxa" w:w="3120"/>
           </w:tcPr>
           <w:p>
             <w:r>
@@ -1062,11 +1186,11 @@
         </w:tc>
         <w:tc>
           <w:tcPr>
-            <w:tcW w:type="dxa" w:w="3135"/>
+            <w:tcW w:type="dxa" w:w="3120"/>
           </w:tcPr>
           <w:p>
             <w:r>
-              <w:t>Archivo PDF o DOCX del documento (máx. 100 MB)</w:t>
+              <w:t>Archivo PDF o DOCX con el documento del proyecto. Máximo 100 MB.</w:t>
             </w:r>
           </w:p>
         </w:tc>
@@ -1074,17 +1198,17 @@
       <w:tr>
         <w:tc>
           <w:tcPr>
-            <w:tcW w:type="dxa" w:w="3135"/>
+            <w:tcW w:type="dxa" w:w="3120"/>
           </w:tcPr>
           <w:p>
             <w:r>
-              <w:t>Archivo de aval</w:t>
+              <w:t>Aval del director</w:t>
             </w:r>
           </w:p>
         </w:tc>
         <w:tc>
           <w:tcPr>
-            <w:tcW w:type="dxa" w:w="3135"/>
+            <w:tcW w:type="dxa" w:w="3120"/>
           </w:tcPr>
           <w:p>
             <w:r>
@@ -1094,11 +1218,11 @@
         </w:tc>
         <w:tc>
           <w:tcPr>
-            <w:tcW w:type="dxa" w:w="3135"/>
+            <w:tcW w:type="dxa" w:w="3120"/>
           </w:tcPr>
           <w:p>
             <w:r>
-              <w:t>Documento de aval del director</w:t>
+              <w:t>Documento PDF o DOCX firmado por el director del proyecto.</w:t>
             </w:r>
           </w:p>
         </w:tc>
@@ -1106,7 +1230,7 @@
       <w:tr>
         <w:tc>
           <w:tcPr>
-            <w:tcW w:type="dxa" w:w="3135"/>
+            <w:tcW w:type="dxa" w:w="3120"/>
           </w:tcPr>
           <w:p>
             <w:r>
@@ -1116,7 +1240,7 @@
         </w:tc>
         <w:tc>
           <w:tcPr>
-            <w:tcW w:type="dxa" w:w="3135"/>
+            <w:tcW w:type="dxa" w:w="3120"/>
           </w:tcPr>
           <w:p>
             <w:r>
@@ -1126,11 +1250,11 @@
         </w:tc>
         <w:tc>
           <w:tcPr>
-            <w:tcW w:type="dxa" w:w="3135"/>
+            <w:tcW w:type="dxa" w:w="3120"/>
           </w:tcPr>
           <w:p>
             <w:r>
-              <w:t>Enlace a repositorio GitHub u otro recurso</w:t>
+              <w:t>Enlace a repositorio de código (GitHub, GitLab) u otro recurso en línea.</w:t>
             </w:r>
           </w:p>
         </w:tc>
@@ -1138,17 +1262,49 @@
       <w:tr>
         <w:tc>
           <w:tcPr>
-            <w:tcW w:type="dxa" w:w="3135"/>
+            <w:tcW w:type="dxa" w:w="3120"/>
           </w:tcPr>
           <w:p>
             <w:r>
-              <w:t>Programa(s)</w:t>
+              <w:t>CvLAC</w:t>
             </w:r>
           </w:p>
         </w:tc>
         <w:tc>
           <w:tcPr>
-            <w:tcW w:type="dxa" w:w="3135"/>
+            <w:tcW w:type="dxa" w:w="3120"/>
+          </w:tcPr>
+          <w:p>
+            <w:r>
+              <w:t>No</w:t>
+            </w:r>
+          </w:p>
+        </w:tc>
+        <w:tc>
+          <w:tcPr>
+            <w:tcW w:type="dxa" w:w="3120"/>
+          </w:tcPr>
+          <w:p>
+            <w:r>
+              <w:t>URL de su perfil CvLAC en el sistema de Colciencias/MinCiencias.</w:t>
+            </w:r>
+          </w:p>
+        </w:tc>
+      </w:tr>
+      <w:tr>
+        <w:tc>
+          <w:tcPr>
+            <w:tcW w:type="dxa" w:w="3120"/>
+          </w:tcPr>
+          <w:p>
+            <w:r>
+              <w:t>Programa(s) académico(s)</w:t>
+            </w:r>
+          </w:p>
+        </w:tc>
+        <w:tc>
+          <w:tcPr>
+            <w:tcW w:type="dxa" w:w="3120"/>
           </w:tcPr>
           <w:p>
             <w:r>
@@ -1158,11 +1314,11 @@
         </w:tc>
         <w:tc>
           <w:tcPr>
-            <w:tcW w:type="dxa" w:w="3135"/>
+            <w:tcW w:type="dxa" w:w="3120"/>
           </w:tcPr>
           <w:p>
             <w:r>
-              <w:t>Seleccione uno o más programas académicos</w:t>
+              <w:t>Seleccione el programa o programas a los que pertenece su proyecto.</w:t>
             </w:r>
           </w:p>
         </w:tc>
@@ -1170,17 +1326,17 @@
       <w:tr>
         <w:tc>
           <w:tcPr>
-            <w:tcW w:type="dxa" w:w="3135"/>
+            <w:tcW w:type="dxa" w:w="3120"/>
           </w:tcPr>
           <w:p>
             <w:r>
-              <w:t>Director(es)</w:t>
+              <w:t>Director(es) propuesto(s)</w:t>
             </w:r>
           </w:p>
         </w:tc>
         <w:tc>
           <w:tcPr>
-            <w:tcW w:type="dxa" w:w="3135"/>
+            <w:tcW w:type="dxa" w:w="3120"/>
           </w:tcPr>
           <w:p>
             <w:r>
@@ -1190,11 +1346,11 @@
         </w:tc>
         <w:tc>
           <w:tcPr>
-            <w:tcW w:type="dxa" w:w="3135"/>
+            <w:tcW w:type="dxa" w:w="3120"/>
           </w:tcPr>
           <w:p>
             <w:r>
-              <w:t>Seleccione director(es) propuestos de la lista</w:t>
+              <w:t>Seleccione de la lista el o los docentes directores propuestos.</w:t>
             </w:r>
           </w:p>
         </w:tc>
@@ -1206,97 +1362,91 @@
         <w:pStyle w:val="Heading2"/>
       </w:pPr>
       <w:r>
-        <w:rPr>
-          <w:color w:val="333333"/>
-        </w:rPr>
         <w:t>Agregar coautor (segundo estudiante)</w:t>
       </w:r>
     </w:p>
     <w:p>
+      <w:pPr/>
       <w:r>
-        <w:rPr>
-          <w:b w:val="0"/>
-        </w:rPr>
-        <w:t>Si el proyecto es en pareja, complete los datos del compañero:</w:t>
+        <w:t>Si el proyecto es desarrollado en pareja, active la opción "¿Tiene compañero de tesis?" y complete los datos del compañero:</w:t>
       </w:r>
     </w:p>
     <w:p>
       <w:pPr>
         <w:pStyle w:val="ListBullet"/>
-        <w:ind w:left="720"/>
       </w:pPr>
       <w:r>
-        <w:t>Nombre completo del compañero</w:t>
+        <w:t>Nombre y Apellidos completos (en mayúsculas).</w:t>
       </w:r>
     </w:p>
     <w:p>
       <w:pPr>
         <w:pStyle w:val="ListBullet"/>
-        <w:ind w:left="720"/>
       </w:pPr>
       <w:r>
-        <w:t>Código de estudiante</w:t>
+        <w:t>Código de estudiante.</w:t>
       </w:r>
     </w:p>
     <w:p>
       <w:pPr>
         <w:pStyle w:val="ListBullet"/>
-        <w:ind w:left="720"/>
       </w:pPr>
       <w:r>
-        <w:t>Cédula de ciudadanía</w:t>
+        <w:t>Cédula de ciudadanía.</w:t>
       </w:r>
     </w:p>
     <w:p>
       <w:pPr>
         <w:pStyle w:val="ListBullet"/>
-        <w:ind w:left="720"/>
       </w:pPr>
       <w:r>
-        <w:t>Correo institucional</w:t>
+        <w:t>Correo institucional.</w:t>
       </w:r>
     </w:p>
     <w:p>
       <w:pPr>
+        <w:pStyle w:val="ListBullet"/>
+      </w:pPr>
+      <w:r>
+        <w:t>CvLAC (opcional).</w:t>
+      </w:r>
+    </w:p>
+    <w:p/>
+    <w:p>
+      <w:pPr>
         <w:pStyle w:val="ListNumber"/>
-        <w:ind w:left="720"/>
       </w:pPr>
       <w:r>
-        <w:t>Haga clic en "Registrar" para guardar el proyecto como borrador.</w:t>
+        <w:t>Haga clic en "Registrar" para guardar el proyecto como Borrador.</w:t>
       </w:r>
     </w:p>
     <w:p>
       <w:pPr>
         <w:pStyle w:val="ListNumber"/>
-        <w:ind w:left="720"/>
       </w:pPr>
       <w:r>
-        <w:t>El proyecto aparecerá en su panel principal con estado Borrador.</w:t>
+        <w:t>El proyecto aparecerá en su panel principal con estado Borrador. Puede editarlo las veces necesarias antes de enviarlo.</w:t>
+      </w:r>
+    </w:p>
+    <w:p/>
+    <w:p>
+      <w:pPr/>
+      <w:r>
+        <w:rPr>
+          <w:i/>
+          <w:color w:val="444488"/>
+        </w:rPr>
+        <w:t>ℹ️  Formatos de archivo permitidos: PDF, DOC, DOCX, JPG, PNG, GIF. Tamaño máximo por archivo: 100 MB.</w:t>
       </w:r>
     </w:p>
     <w:p>
-      <w:r>
-        <w:rPr>
-          <w:b w:val="0"/>
-        </w:rPr>
-      </w:r>
-    </w:p>
-    <w:p>
+      <w:pPr/>
       <w:r>
         <w:rPr>
           <w:i/>
-          <w:color w:val="0D6EFD"/>
+          <w:color w:val="444488"/>
         </w:rPr>
-        <w:t>ℹ️  Formatos de archivo permitidos: PDF, DOC, DOCX, JPG, PNG, GIF. Máximo 5 archivos por carga.</w:t>
-      </w:r>
-    </w:p>
-    <w:p>
-      <w:r>
-        <w:rPr>
-          <w:i/>
-          <w:color w:val="CC6600"/>
-        </w:rPr>
-        <w:t>⚠️  Verifique que las ventanas de recepción del programa estén abiertas. No podrá enviar a un programa con recepción cerrada.</w:t>
+        <w:t>⚠️  Verifique que la ventana de recepción del programa esté abierta antes de intentar enviar. Si la recepción está cerrada, el botón Enviar no estará disponible.</w:t>
       </w:r>
     </w:p>
     <w:p>
@@ -1312,21 +1462,18 @@
         <w:rPr>
           <w:color w:val="C05A12"/>
         </w:rPr>
-        <w:t>7. Enviar proyecto a evaluación</w:t>
+        <w:t>8. Enviar proyecto a evaluación</w:t>
       </w:r>
     </w:p>
     <w:p>
+      <w:pPr/>
       <w:r>
-        <w:rPr>
-          <w:b w:val="0"/>
-        </w:rPr>
         <w:t>Cuando su proyecto esté completo y listo para ser evaluado:</w:t>
       </w:r>
     </w:p>
     <w:p>
       <w:pPr>
         <w:pStyle w:val="ListNumber"/>
-        <w:ind w:left="720"/>
       </w:pPr>
       <w:r>
         <w:t>Vaya al panel principal del estudiante.</w:t>
@@ -1335,7 +1482,6 @@
     <w:p>
       <w:pPr>
         <w:pStyle w:val="ListNumber"/>
-        <w:ind w:left="720"/>
       </w:pPr>
       <w:r>
         <w:t>Verifique que toda la información y archivos estén correctos.</w:t>
@@ -1344,16 +1490,14 @@
     <w:p>
       <w:pPr>
         <w:pStyle w:val="ListNumber"/>
-        <w:ind w:left="720"/>
       </w:pPr>
       <w:r>
-        <w:t>Haga clic en el botón "Enviar a evaluar".</w:t>
+        <w:t>Haga clic en el botón verde "Enviar a evaluar".</w:t>
       </w:r>
     </w:p>
     <w:p>
       <w:pPr>
         <w:pStyle w:val="ListNumber"/>
-        <w:ind w:left="720"/>
       </w:pPr>
       <w:r>
         <w:t>Confirme el envío en el diálogo de confirmación.</w:t>
@@ -1362,31 +1506,21 @@
     <w:p>
       <w:pPr>
         <w:pStyle w:val="ListNumber"/>
-        <w:ind w:left="720"/>
       </w:pPr>
       <w:r>
-        <w:t>El estado cambiará a Enviado.</w:t>
+        <w:t>El estado cambiará a "Enviado".</w:t>
       </w:r>
     </w:p>
+    <w:p/>
     <w:p>
+      <w:pPr/>
       <w:r>
-        <w:rPr>
-          <w:b w:val="0"/>
-        </w:rPr>
-      </w:r>
-    </w:p>
-    <w:p>
-      <w:r>
-        <w:rPr>
-          <w:b w:val="0"/>
-        </w:rPr>
         <w:t>A partir de este momento:</w:t>
       </w:r>
     </w:p>
     <w:p>
       <w:pPr>
         <w:pStyle w:val="ListBullet"/>
-        <w:ind w:left="720"/>
       </w:pPr>
       <w:r>
         <w:t>El administrador del programa revisará su documentación.</w:t>
@@ -1395,7 +1529,6 @@
     <w:p>
       <w:pPr>
         <w:pStyle w:val="ListBullet"/>
-        <w:ind w:left="720"/>
       </w:pPr>
       <w:r>
         <w:t>Se le asignarán evaluadores.</w:t>
@@ -1404,19 +1537,20 @@
     <w:p>
       <w:pPr>
         <w:pStyle w:val="ListBullet"/>
-        <w:ind w:left="720"/>
       </w:pPr>
       <w:r>
-        <w:t>Recibirá notificaciones por correo sobre el avance.</w:t>
+        <w:t>Recibirá notificaciones por correo electrónico sobre el avance.</w:t>
       </w:r>
     </w:p>
+    <w:p/>
     <w:p>
+      <w:pPr/>
       <w:r>
         <w:rPr>
           <w:i/>
-          <w:color w:val="CC6600"/>
+          <w:color w:val="444488"/>
         </w:rPr>
-        <w:t>⚠️  Esta acción es irreversible. Asegúrese de que su documento esté completo antes de enviarlo.</w:t>
+        <w:t>⚠️  Esta acción es irreversible. Asegúrese de que su documento esté completo y actualizado antes de enviarlo.</w:t>
       </w:r>
     </w:p>
     <w:p>
@@ -1432,72 +1566,128 @@
         <w:rPr>
           <w:color w:val="C05A12"/>
         </w:rPr>
-        <w:t>8. Seguimiento del proyecto (Timeline)</w:t>
+        <w:t>9. Seguimiento del proyecto (Timeline)</w:t>
       </w:r>
     </w:p>
     <w:p>
+      <w:pPr/>
       <w:r>
-        <w:rPr>
-          <w:b w:val="0"/>
-        </w:rPr>
-        <w:t>La línea de tiempo le permite ver el progreso completo de su proyecto de grado.</w:t>
+        <w:t>La línea de tiempo (Timeline) le permite ver el progreso completo de su proyecto de grado, incluyendo cada acción realizada por el administrador, los evaluadores y el sistema.</w:t>
+      </w:r>
+    </w:p>
+    <w:p/>
+    <w:p>
+      <w:pPr>
+        <w:pStyle w:val="Heading2"/>
+      </w:pPr>
+      <w:r>
+        <w:t>Cómo acceder al Timeline</w:t>
       </w:r>
     </w:p>
     <w:p>
       <w:pPr>
-        <w:pStyle w:val="Heading2"/>
+        <w:pStyle w:val="ListNumber"/>
       </w:pPr>
       <w:r>
-        <w:rPr>
-          <w:color w:val="333333"/>
-        </w:rPr>
-        <w:t>Cómo acceder</w:t>
+        <w:t>Inicie sesión y acceda al panel principal.</w:t>
       </w:r>
     </w:p>
     <w:p>
       <w:pPr>
         <w:pStyle w:val="ListNumber"/>
-        <w:ind w:left="720"/>
       </w:pPr>
       <w:r>
-        <w:t>En el panel principal, haga clic en su proyecto.</w:t>
+        <w:t>Haga clic en su proyecto o en el botón "Ver timeline".</w:t>
+      </w:r>
+    </w:p>
+    <w:p/>
+    <w:p>
+      <w:pPr>
+        <w:pStyle w:val="Heading2"/>
+      </w:pPr>
+      <w:r>
+        <w:t>Información visible en el Timeline</w:t>
       </w:r>
     </w:p>
     <w:p>
       <w:pPr>
-        <w:pStyle w:val="ListNumber"/>
-        <w:ind w:left="720"/>
+        <w:pStyle w:val="ListBullet"/>
       </w:pPr>
       <w:r>
-        <w:t>Navegue a la sección Timeline / Línea de tiempo.</w:t>
+        <w:t>Título y estado actual del proyecto.</w:t>
       </w:r>
     </w:p>
     <w:p>
       <w:pPr>
+        <w:pStyle w:val="ListBullet"/>
+      </w:pPr>
+      <w:r>
+        <w:t>Nombre del autor o autores y su información académica.</w:t>
+      </w:r>
+    </w:p>
+    <w:p>
+      <w:pPr>
+        <w:pStyle w:val="ListBullet"/>
+      </w:pPr>
+      <w:r>
+        <w:t>Ronda de revisión actual.</w:t>
+      </w:r>
+    </w:p>
+    <w:p>
+      <w:pPr>
+        <w:pStyle w:val="ListBullet"/>
+      </w:pPr>
+      <w:r>
+        <w:t>Calificaciones parciales por rúbrica y calificación final ponderada.</w:t>
+      </w:r>
+    </w:p>
+    <w:p>
+      <w:pPr>
+        <w:pStyle w:val="ListBullet"/>
+      </w:pPr>
+      <w:r>
+        <w:t>Comentarios y retroalimentación de cada evaluador.</w:t>
+      </w:r>
+    </w:p>
+    <w:p>
+      <w:pPr>
+        <w:pStyle w:val="ListBullet"/>
+      </w:pPr>
+      <w:r>
+        <w:t>Archivos adjuntos de retroalimentación.</w:t>
+      </w:r>
+    </w:p>
+    <w:p>
+      <w:pPr>
+        <w:pStyle w:val="ListBullet"/>
+      </w:pPr>
+      <w:r>
+        <w:t>Fecha, hora y lugar de la sustentación (cuando esté programada).</w:t>
+      </w:r>
+    </w:p>
+    <w:p/>
+    <w:p>
+      <w:pPr>
         <w:pStyle w:val="Heading2"/>
       </w:pPr>
       <w:r>
-        <w:rPr>
-          <w:color w:val="333333"/>
-        </w:rPr>
-        <w:t>Eventos que verá en la línea de tiempo</w:t>
+        <w:t>Eventos que aparecen en la línea de tiempo</w:t>
       </w:r>
     </w:p>
     <w:tbl>
       <w:tblPr>
-        <w:tblStyle w:val="LightShading-Accent1"/>
+        <w:tblStyle w:val="TableGrid"/>
         <w:tblW w:type="auto" w:w="0"/>
-        <w:jc w:val="center"/>
         <w:tblLook w:firstColumn="1" w:firstRow="1" w:lastColumn="0" w:lastRow="0" w:noHBand="0" w:noVBand="1" w:val="04A0"/>
       </w:tblPr>
       <w:tblGrid>
-        <w:gridCol w:w="4703"/>
-        <w:gridCol w:w="4703"/>
+        <w:gridCol w:w="4680"/>
+        <w:gridCol w:w="4680"/>
       </w:tblGrid>
       <w:tr>
         <w:tc>
           <w:tcPr>
-            <w:tcW w:type="dxa" w:w="4703"/>
+            <w:tcW w:type="dxa" w:w="4680"/>
           </w:tcPr>
           <w:p>
             <w:r>
@@ -1510,7 +1700,7 @@
         </w:tc>
         <w:tc>
           <w:tcPr>
-            <w:tcW w:type="dxa" w:w="4703"/>
+            <w:tcW w:type="dxa" w:w="4680"/>
           </w:tcPr>
           <w:p>
             <w:r>
@@ -1525,21 +1715,21 @@
       <w:tr>
         <w:tc>
           <w:tcPr>
-            <w:tcW w:type="dxa" w:w="4703"/>
+            <w:tcW w:type="dxa" w:w="4680"/>
           </w:tcPr>
           <w:p>
             <w:r>
-              <w:t>Proyecto enviado</w:t>
+              <w:t>Tesis enviada a evaluación</w:t>
             </w:r>
           </w:p>
         </w:tc>
         <w:tc>
           <w:tcPr>
-            <w:tcW w:type="dxa" w:w="4703"/>
+            <w:tcW w:type="dxa" w:w="4680"/>
           </w:tcPr>
           <w:p>
             <w:r>
-              <w:t>Fecha en que envió su proyecto</w:t>
+              <w:t>El estudiante envió el proyecto al sistema.</w:t>
             </w:r>
           </w:p>
         </w:tc>
@@ -1547,21 +1737,21 @@
       <w:tr>
         <w:tc>
           <w:tcPr>
-            <w:tcW w:type="dxa" w:w="4703"/>
+            <w:tcW w:type="dxa" w:w="4680"/>
           </w:tcPr>
           <w:p>
             <w:r>
-              <w:t>Revisión administrativa</w:t>
+              <w:t>Comentario del administrador</w:t>
             </w:r>
           </w:p>
         </w:tc>
         <w:tc>
           <w:tcPr>
-            <w:tcW w:type="dxa" w:w="4703"/>
+            <w:tcW w:type="dxa" w:w="4680"/>
           </w:tcPr>
           <w:p>
             <w:r>
-              <w:t>El administrador revisó su documentación</w:t>
+              <w:t>El administrador emitió un comentario o retroalimentación.</w:t>
             </w:r>
           </w:p>
         </w:tc>
@@ -1569,7 +1759,29 @@
       <w:tr>
         <w:tc>
           <w:tcPr>
-            <w:tcW w:type="dxa" w:w="4703"/>
+            <w:tcW w:type="dxa" w:w="4680"/>
+          </w:tcPr>
+          <w:p>
+            <w:r>
+              <w:t>Decisión del administrador</w:t>
+            </w:r>
+          </w:p>
+        </w:tc>
+        <w:tc>
+          <w:tcPr>
+            <w:tcW w:type="dxa" w:w="4680"/>
+          </w:tcPr>
+          <w:p>
+            <w:r>
+              <w:t>El administrador aprobó o rechazó la documentación.</w:t>
+            </w:r>
+          </w:p>
+        </w:tc>
+      </w:tr>
+      <w:tr>
+        <w:tc>
+          <w:tcPr>
+            <w:tcW w:type="dxa" w:w="4680"/>
           </w:tcPr>
           <w:p>
             <w:r>
@@ -1579,11 +1791,11 @@
         </w:tc>
         <w:tc>
           <w:tcPr>
-            <w:tcW w:type="dxa" w:w="4703"/>
+            <w:tcW w:type="dxa" w:w="4680"/>
           </w:tcPr>
           <w:p>
             <w:r>
-              <w:t>Se asignaron evaluadores a su proyecto</w:t>
+              <w:t>Se asignaron evaluadores académicos al proyecto.</w:t>
             </w:r>
           </w:p>
         </w:tc>
@@ -1591,21 +1803,21 @@
       <w:tr>
         <w:tc>
           <w:tcPr>
-            <w:tcW w:type="dxa" w:w="4703"/>
+            <w:tcW w:type="dxa" w:w="4680"/>
           </w:tcPr>
           <w:p>
             <w:r>
-              <w:t>En evaluación académica</w:t>
+              <w:t>Revisión aprobada</w:t>
             </w:r>
           </w:p>
         </w:tc>
         <w:tc>
           <w:tcPr>
-            <w:tcW w:type="dxa" w:w="4703"/>
+            <w:tcW w:type="dxa" w:w="4680"/>
           </w:tcPr>
           <w:p>
             <w:r>
-              <w:t>Los evaluadores están revisando su trabajo</w:t>
+              <w:t>Un evaluador aprobó el documento sin observaciones.</w:t>
             </w:r>
           </w:p>
         </w:tc>
@@ -1613,21 +1825,21 @@
       <w:tr>
         <w:tc>
           <w:tcPr>
-            <w:tcW w:type="dxa" w:w="4703"/>
+            <w:tcW w:type="dxa" w:w="4680"/>
           </w:tcPr>
           <w:p>
             <w:r>
-              <w:t>Concepto emitido</w:t>
+              <w:t>Revisión con observaciones</w:t>
             </w:r>
           </w:p>
         </w:tc>
         <w:tc>
           <w:tcPr>
-            <w:tcW w:type="dxa" w:w="4703"/>
+            <w:tcW w:type="dxa" w:w="4680"/>
           </w:tcPr>
           <w:p>
             <w:r>
-              <w:t>Los evaluadores emitieron su concepto</w:t>
+              <w:t>Un evaluador solicitó correcciones al documento.</w:t>
             </w:r>
           </w:p>
         </w:tc>
@@ -1635,21 +1847,21 @@
       <w:tr>
         <w:tc>
           <w:tcPr>
-            <w:tcW w:type="dxa" w:w="4703"/>
+            <w:tcW w:type="dxa" w:w="4680"/>
           </w:tcPr>
           <w:p>
             <w:r>
-              <w:t>Correcciones solicitadas</w:t>
+              <w:t>Estudiante envió revisión</w:t>
             </w:r>
           </w:p>
         </w:tc>
         <w:tc>
           <w:tcPr>
-            <w:tcW w:type="dxa" w:w="4703"/>
+            <w:tcW w:type="dxa" w:w="4680"/>
           </w:tcPr>
           <w:p>
             <w:r>
-              <w:t>Se requieren cambios en su documento</w:t>
+              <w:t>El estudiante envió la versión corregida del documento.</w:t>
             </w:r>
           </w:p>
         </w:tc>
@@ -1657,21 +1869,21 @@
       <w:tr>
         <w:tc>
           <w:tcPr>
-            <w:tcW w:type="dxa" w:w="4703"/>
+            <w:tcW w:type="dxa" w:w="4680"/>
           </w:tcPr>
           <w:p>
             <w:r>
-              <w:t>Aprobada para sustentación</w:t>
+              <w:t>Evaluación enviada</w:t>
             </w:r>
           </w:p>
         </w:tc>
         <w:tc>
           <w:tcPr>
-            <w:tcW w:type="dxa" w:w="4703"/>
+            <w:tcW w:type="dxa" w:w="4680"/>
           </w:tcPr>
           <w:p>
             <w:r>
-              <w:t>Su proyecto fue aprobado para sustentar</w:t>
+              <w:t>Un evaluador envió su evaluación de sustentación.</w:t>
             </w:r>
           </w:p>
         </w:tc>
@@ -1679,7 +1891,7 @@
       <w:tr>
         <w:tc>
           <w:tcPr>
-            <w:tcW w:type="dxa" w:w="4703"/>
+            <w:tcW w:type="dxa" w:w="4680"/>
           </w:tcPr>
           <w:p>
             <w:r>
@@ -1689,11 +1901,11 @@
         </w:tc>
         <w:tc>
           <w:tcPr>
-            <w:tcW w:type="dxa" w:w="4703"/>
+            <w:tcW w:type="dxa" w:w="4680"/>
           </w:tcPr>
           <w:p>
             <w:r>
-              <w:t>Fecha, hora y lugar de la sustentación</w:t>
+              <w:t>Se agendó la fecha, hora y lugar de la sustentación.</w:t>
             </w:r>
           </w:p>
         </w:tc>
@@ -1701,21 +1913,21 @@
       <w:tr>
         <w:tc>
           <w:tcPr>
-            <w:tcW w:type="dxa" w:w="4703"/>
+            <w:tcW w:type="dxa" w:w="4680"/>
           </w:tcPr>
           <w:p>
             <w:r>
-              <w:t>Sustentación evaluada</w:t>
+              <w:t>Estado de la tesis actualizado</w:t>
             </w:r>
           </w:p>
         </w:tc>
         <w:tc>
           <w:tcPr>
-            <w:tcW w:type="dxa" w:w="4703"/>
+            <w:tcW w:type="dxa" w:w="4680"/>
           </w:tcPr>
           <w:p>
             <w:r>
-              <w:t>Los evaluadores calificaron su sustentación</w:t>
+              <w:t>El administrador cambió el estado del proyecto.</w:t>
             </w:r>
           </w:p>
         </w:tc>
@@ -1723,43 +1935,21 @@
       <w:tr>
         <w:tc>
           <w:tcPr>
-            <w:tcW w:type="dxa" w:w="4703"/>
+            <w:tcW w:type="dxa" w:w="4680"/>
           </w:tcPr>
           <w:p>
             <w:r>
-              <w:t>Acta firmada</w:t>
+              <w:t>Firma de acta registrada</w:t>
             </w:r>
           </w:p>
         </w:tc>
         <w:tc>
           <w:tcPr>
-            <w:tcW w:type="dxa" w:w="4703"/>
+            <w:tcW w:type="dxa" w:w="4680"/>
           </w:tcPr>
           <w:p>
             <w:r>
-              <w:t>Todas las firmas fueron recolectadas</w:t>
-            </w:r>
-          </w:p>
-        </w:tc>
-      </w:tr>
-      <w:tr>
-        <w:tc>
-          <w:tcPr>
-            <w:tcW w:type="dxa" w:w="4703"/>
-          </w:tcPr>
-          <w:p>
-            <w:r>
-              <w:t>Proceso finalizado</w:t>
-            </w:r>
-          </w:p>
-        </w:tc>
-        <w:tc>
-          <w:tcPr>
-            <w:tcW w:type="dxa" w:w="4703"/>
-          </w:tcPr>
-          <w:p>
-            <w:r>
-              <w:t>Su proyecto de grado fue completado</w:t>
+              <w:t>Se registró la firma de un participante en el acta.</w:t>
             </w:r>
           </w:p>
         </w:tc>
@@ -1771,446 +1961,37 @@
         <w:pStyle w:val="Heading2"/>
       </w:pPr>
       <w:r>
-        <w:rPr>
-          <w:color w:val="333333"/>
-        </w:rPr>
-        <w:t>Información adicional en el timeline</w:t>
+        <w:t>Calificaciones</w:t>
       </w:r>
     </w:p>
     <w:p>
-      <w:pPr>
-        <w:pStyle w:val="ListBullet"/>
-        <w:ind w:left="720"/>
-      </w:pPr>
+      <w:pPr/>
       <w:r>
-        <w:t>Calificaciones parciales y finales (cuando estén disponibles).</w:t>
+        <w:t>La calificación final se calcula de forma ponderada entre la nota del documento y la nota de la sustentación:</w:t>
       </w:r>
     </w:p>
+    <w:p/>
     <w:p>
-      <w:pPr>
-        <w:pStyle w:val="ListBullet"/>
-        <w:ind w:left="720"/>
-      </w:pPr>
+      <w:pPr/>
       <w:r>
-        <w:t>Observaciones y retroalimentación de los evaluadores.</w:t>
+        <w:t>Calificación Final = (Nota Documento × Peso%) + (Nota Sustentación × Peso%)</w:t>
       </w:r>
     </w:p>
-    <w:p>
-      <w:pPr>
-        <w:pStyle w:val="ListBullet"/>
-        <w:ind w:left="720"/>
-      </w:pPr>
-      <w:r>
-        <w:t>Archivos adjuntos de retroalimentación.</w:t>
-      </w:r>
-    </w:p>
-    <w:p>
-      <w:pPr>
-        <w:pStyle w:val="ListBullet"/>
-        <w:ind w:left="720"/>
-      </w:pPr>
-      <w:r>
-        <w:t>Fecha y lugar de la sustentación.</w:t>
-      </w:r>
-    </w:p>
-    <w:p>
-      <w:r>
-        <w:br w:type="page"/>
-      </w:r>
-    </w:p>
-    <w:p>
-      <w:pPr>
-        <w:pStyle w:val="Heading1"/>
-      </w:pPr>
-      <w:r>
-        <w:rPr>
-          <w:color w:val="C05A12"/>
-        </w:rPr>
-        <w:t>9. Enviar correcciones</w:t>
-      </w:r>
-    </w:p>
-    <w:p>
-      <w:r>
-        <w:rPr>
-          <w:b w:val="0"/>
-        </w:rPr>
-        <w:t>Si los evaluadores solicitan correcciones a su documento:</w:t>
-      </w:r>
-    </w:p>
-    <w:p>
-      <w:pPr>
-        <w:pStyle w:val="ListNumber"/>
-        <w:ind w:left="720"/>
-      </w:pPr>
-      <w:r>
-        <w:t>Recibirá una notificación por correo electrónico.</w:t>
-      </w:r>
-    </w:p>
-    <w:p>
-      <w:pPr>
-        <w:pStyle w:val="ListNumber"/>
-        <w:ind w:left="720"/>
-      </w:pPr>
-      <w:r>
-        <w:t>Ingrese al sistema y vaya a la línea de tiempo de su proyecto.</w:t>
-      </w:r>
-    </w:p>
-    <w:p>
-      <w:pPr>
-        <w:pStyle w:val="ListNumber"/>
-        <w:ind w:left="720"/>
-      </w:pPr>
-      <w:r>
-        <w:t>Revise las observaciones y retroalimentación de cada evaluador.</w:t>
-      </w:r>
-    </w:p>
-    <w:p>
-      <w:pPr>
-        <w:pStyle w:val="ListNumber"/>
-        <w:ind w:left="720"/>
-      </w:pPr>
-      <w:r>
-        <w:t>Prepare la versión corregida de su documento.</w:t>
-      </w:r>
-    </w:p>
-    <w:p>
-      <w:pPr>
-        <w:pStyle w:val="ListNumber"/>
-        <w:ind w:left="720"/>
-      </w:pPr>
-      <w:r>
-        <w:t>En la sección de correcciones del timeline:</w:t>
-      </w:r>
-    </w:p>
-    <w:p>
-      <w:pPr>
-        <w:pStyle w:val="ListBullet"/>
-        <w:ind w:left="1440"/>
-      </w:pPr>
-      <w:r>
-        <w:t>Escriba un comentario explicando los cambios realizados.</w:t>
-      </w:r>
-    </w:p>
-    <w:p>
-      <w:pPr>
-        <w:pStyle w:val="ListBullet"/>
-        <w:ind w:left="1440"/>
-      </w:pPr>
-      <w:r>
-        <w:t>Adjunte el documento corregido (PDF/DOCX).</w:t>
-      </w:r>
-    </w:p>
-    <w:p>
-      <w:pPr>
-        <w:pStyle w:val="ListNumber"/>
-        <w:ind w:left="720"/>
-      </w:pPr>
-      <w:r>
-        <w:t>Haga clic en "Enviar correcciones".</w:t>
-      </w:r>
-    </w:p>
-    <w:p>
-      <w:pPr>
-        <w:pStyle w:val="ListNumber"/>
-        <w:ind w:left="720"/>
-      </w:pPr>
-      <w:r>
-        <w:t>El sistema incrementará la ronda de revisión.</w:t>
-      </w:r>
-    </w:p>
-    <w:p>
-      <w:pPr>
-        <w:pStyle w:val="ListNumber"/>
-        <w:ind w:left="720"/>
-      </w:pPr>
-      <w:r>
-        <w:t>Los evaluadores recibirán notificación para re-evaluar.</w:t>
-      </w:r>
-    </w:p>
-    <w:p>
-      <w:r>
-        <w:rPr>
-          <w:b w:val="0"/>
-        </w:rPr>
-      </w:r>
-    </w:p>
-    <w:p>
-      <w:r>
-        <w:rPr>
-          <w:i/>
-          <w:color w:val="0D6EFD"/>
-        </w:rPr>
-        <w:t>ℹ️  Puede haber múltiples rondas de corrección. Cada ronda queda registrada en la línea de tiempo.</w:t>
-      </w:r>
-    </w:p>
-    <w:p>
-      <w:r>
-        <w:br w:type="page"/>
-      </w:r>
-    </w:p>
-    <w:p>
-      <w:pPr>
-        <w:pStyle w:val="Heading1"/>
-      </w:pPr>
-      <w:r>
-        <w:rPr>
-          <w:color w:val="C05A12"/>
-        </w:rPr>
-        <w:t>10. Firma de documentos</w:t>
-      </w:r>
-    </w:p>
-    <w:p>
-      <w:r>
-        <w:rPr>
-          <w:b w:val="0"/>
-        </w:rPr>
-        <w:t>Al finalizar el proceso de evaluación, se generará un acta de sustentación que debe ser firmada digitalmente.</w:t>
-      </w:r>
-    </w:p>
-    <w:p>
-      <w:pPr>
-        <w:pStyle w:val="Heading2"/>
-      </w:pPr>
-      <w:r>
-        <w:rPr>
-          <w:color w:val="333333"/>
-        </w:rPr>
-        <w:t>Proceso de firma</w:t>
-      </w:r>
-    </w:p>
-    <w:p>
-      <w:pPr>
-        <w:pStyle w:val="ListNumber"/>
-        <w:ind w:left="720"/>
-      </w:pPr>
-      <w:r>
-        <w:t>Recibirá un correo electrónico con un enlace único de firma.</w:t>
-      </w:r>
-    </w:p>
-    <w:p>
-      <w:pPr>
-        <w:pStyle w:val="ListNumber"/>
-        <w:ind w:left="720"/>
-      </w:pPr>
-      <w:r>
-        <w:t>Haga clic en el enlace (no requiere iniciar sesión).</w:t>
-      </w:r>
-    </w:p>
-    <w:p>
-      <w:pPr>
-        <w:pStyle w:val="ListNumber"/>
-        <w:ind w:left="720"/>
-      </w:pPr>
-      <w:r>
-        <w:t>En la página de firma:</w:t>
-      </w:r>
-    </w:p>
-    <w:p>
-      <w:pPr>
-        <w:pStyle w:val="ListBullet"/>
-        <w:ind w:left="1440"/>
-      </w:pPr>
-      <w:r>
-        <w:t>Revise la información del proyecto y el acta.</w:t>
-      </w:r>
-    </w:p>
-    <w:p>
-      <w:pPr>
-        <w:pStyle w:val="ListBullet"/>
-        <w:ind w:left="1440"/>
-      </w:pPr>
-      <w:r>
-        <w:t>Haga clic en "Descargar PDF" para revisar el documento completo.</w:t>
-      </w:r>
-    </w:p>
-    <w:p>
-      <w:pPr>
-        <w:pStyle w:val="ListNumber"/>
-        <w:ind w:left="720"/>
-      </w:pPr>
-      <w:r>
-        <w:t>Elija un método de firma:</w:t>
-      </w:r>
-    </w:p>
-    <w:p>
-      <w:pPr>
-        <w:pStyle w:val="ListBullet"/>
-        <w:ind w:left="1440"/>
-      </w:pPr>
-      <w:r>
-        <w:t>Dibujar: Use el mouse o pantalla táctil para dibujar su firma.</w:t>
-      </w:r>
-    </w:p>
-    <w:p>
-      <w:pPr>
-        <w:pStyle w:val="ListBullet"/>
-        <w:ind w:left="1440"/>
-      </w:pPr>
-      <w:r>
-        <w:t>Subir imagen: Cargue una imagen escaneada de su firma.</w:t>
-      </w:r>
-    </w:p>
-    <w:p>
-      <w:pPr>
-        <w:pStyle w:val="ListNumber"/>
-        <w:ind w:left="720"/>
-      </w:pPr>
-      <w:r>
-        <w:t>Suba el PDF firmado si es requerido.</w:t>
-      </w:r>
-    </w:p>
-    <w:p>
-      <w:pPr>
-        <w:pStyle w:val="ListNumber"/>
-        <w:ind w:left="720"/>
-      </w:pPr>
-      <w:r>
-        <w:t>Haga clic en "Enviar firma".</w:t>
-      </w:r>
-    </w:p>
-    <w:p>
-      <w:pPr>
-        <w:pStyle w:val="ListNumber"/>
-        <w:ind w:left="720"/>
-      </w:pPr>
-      <w:r>
-        <w:t>Será redirigido a una página de confirmación.</w:t>
-      </w:r>
-    </w:p>
-    <w:p>
-      <w:r>
-        <w:rPr>
-          <w:b w:val="0"/>
-        </w:rPr>
-      </w:r>
-    </w:p>
-    <w:p>
-      <w:r>
-        <w:rPr>
-          <w:i/>
-          <w:color w:val="0D6EFD"/>
-        </w:rPr>
-        <w:t>ℹ️  El enlace de firma es único y personal. No lo comparta con otras personas.</w:t>
-      </w:r>
-    </w:p>
-    <w:p>
-      <w:pPr>
-        <w:pStyle w:val="Heading2"/>
-      </w:pPr>
-      <w:r>
-        <w:rPr>
-          <w:color w:val="333333"/>
-        </w:rPr>
-        <w:t>Carta meritoria</w:t>
-      </w:r>
-    </w:p>
-    <w:p>
-      <w:r>
-        <w:rPr>
-          <w:b w:val="0"/>
-        </w:rPr>
-        <w:t>Si su proyecto obtuvo una calificación meritoria (≥ 4.8/5.0), recibirá un enlace adicional para firmar la carta de graduación meritoria. El proceso es idéntico al de firma del acta.</w:t>
-      </w:r>
-    </w:p>
-    <w:p>
-      <w:r>
-        <w:br w:type="page"/>
-      </w:r>
-    </w:p>
-    <w:p>
-      <w:pPr>
-        <w:pStyle w:val="Heading1"/>
-      </w:pPr>
-      <w:r>
-        <w:rPr>
-          <w:color w:val="C05A12"/>
-        </w:rPr>
-        <w:t>11. Preguntas frecuentes</w:t>
-      </w:r>
-    </w:p>
-    <w:p>
-      <w:pPr>
-        <w:pStyle w:val="Heading2"/>
-      </w:pPr>
-      <w:r>
-        <w:rPr>
-          <w:color w:val="333333"/>
-        </w:rPr>
-        <w:t>¿Puedo editar mi proyecto después de enviarlo?</w:t>
-      </w:r>
-    </w:p>
-    <w:p>
-      <w:r>
-        <w:rPr>
-          <w:b w:val="0"/>
-        </w:rPr>
-        <w:t>No. Una vez enviado a evaluación, el proyecto queda en modo solo lectura. Asegúrese de que toda la información esté correcta antes de enviarlo.</w:t>
-      </w:r>
-    </w:p>
-    <w:p>
-      <w:pPr>
-        <w:pStyle w:val="Heading2"/>
-      </w:pPr>
-      <w:r>
-        <w:rPr>
-          <w:color w:val="333333"/>
-        </w:rPr>
-        <w:t>¿Cuántos archivos puedo subir?</w:t>
-      </w:r>
-    </w:p>
-    <w:p>
-      <w:r>
-        <w:rPr>
-          <w:b w:val="0"/>
-        </w:rPr>
-        <w:t>Puede subir hasta 5 archivos por carga, con un tamaño máximo de 100 MB cada uno. Formatos: PDF, DOC, DOCX, JPG, PNG, GIF.</w:t>
-      </w:r>
-    </w:p>
-    <w:p>
-      <w:pPr>
-        <w:pStyle w:val="Heading2"/>
-      </w:pPr>
-      <w:r>
-        <w:rPr>
-          <w:color w:val="333333"/>
-        </w:rPr>
-        <w:t>¿Cómo sé si mis evaluadores ya revisaron mi proyecto?</w:t>
-      </w:r>
-    </w:p>
-    <w:p>
-      <w:r>
-        <w:rPr>
-          <w:b w:val="0"/>
-        </w:rPr>
-        <w:t>Revise la línea de tiempo de su proyecto. Cuando un evaluador emita su concepto, aparecerá un evento nuevo con la retroalimentación.</w:t>
-      </w:r>
-    </w:p>
-    <w:p>
-      <w:pPr>
-        <w:pStyle w:val="Heading2"/>
-      </w:pPr>
-      <w:r>
-        <w:rPr>
-          <w:color w:val="333333"/>
-        </w:rPr>
-        <w:t>¿Qué significan las calificaciones?</w:t>
-      </w:r>
-    </w:p>
+    <w:p/>
     <w:tbl>
       <w:tblPr>
-        <w:tblStyle w:val="LightShading-Accent1"/>
+        <w:tblStyle w:val="TableGrid"/>
         <w:tblW w:type="auto" w:w="0"/>
-        <w:jc w:val="center"/>
         <w:tblLook w:firstColumn="1" w:firstRow="1" w:lastColumn="0" w:lastRow="0" w:noHBand="0" w:noVBand="1" w:val="04A0"/>
       </w:tblPr>
       <w:tblGrid>
-        <w:gridCol w:w="4703"/>
-        <w:gridCol w:w="4703"/>
+        <w:gridCol w:w="4680"/>
+        <w:gridCol w:w="4680"/>
       </w:tblGrid>
       <w:tr>
         <w:tc>
           <w:tcPr>
-            <w:tcW w:type="dxa" w:w="4703"/>
+            <w:tcW w:type="dxa" w:w="4680"/>
           </w:tcPr>
           <w:p>
             <w:r>
@@ -2223,7 +2004,7 @@
         </w:tc>
         <w:tc>
           <w:tcPr>
-            <w:tcW w:type="dxa" w:w="4703"/>
+            <w:tcW w:type="dxa" w:w="4680"/>
           </w:tcPr>
           <w:p>
             <w:r>
@@ -2238,7 +2019,7 @@
       <w:tr>
         <w:tc>
           <w:tcPr>
-            <w:tcW w:type="dxa" w:w="4703"/>
+            <w:tcW w:type="dxa" w:w="4680"/>
           </w:tcPr>
           <w:p>
             <w:r>
@@ -2248,7 +2029,7 @@
         </w:tc>
         <w:tc>
           <w:tcPr>
-            <w:tcW w:type="dxa" w:w="4703"/>
+            <w:tcW w:type="dxa" w:w="4680"/>
           </w:tcPr>
           <w:p>
             <w:r>
@@ -2260,7 +2041,7 @@
       <w:tr>
         <w:tc>
           <w:tcPr>
-            <w:tcW w:type="dxa" w:w="4703"/>
+            <w:tcW w:type="dxa" w:w="4680"/>
           </w:tcPr>
           <w:p>
             <w:r>
@@ -2270,7 +2051,7 @@
         </w:tc>
         <w:tc>
           <w:tcPr>
-            <w:tcW w:type="dxa" w:w="4703"/>
+            <w:tcW w:type="dxa" w:w="4680"/>
           </w:tcPr>
           <w:p>
             <w:r>
@@ -2282,7 +2063,7 @@
       <w:tr>
         <w:tc>
           <w:tcPr>
-            <w:tcW w:type="dxa" w:w="4703"/>
+            <w:tcW w:type="dxa" w:w="4680"/>
           </w:tcPr>
           <w:p>
             <w:r>
@@ -2292,7 +2073,7 @@
         </w:tc>
         <w:tc>
           <w:tcPr>
-            <w:tcW w:type="dxa" w:w="4703"/>
+            <w:tcW w:type="dxa" w:w="4680"/>
           </w:tcPr>
           <w:p>
             <w:r>
@@ -2304,40 +2085,613 @@
     </w:tbl>
     <w:p/>
     <w:p>
+      <w:pPr/>
       <w:r>
         <w:rPr>
-          <w:b w:val="0"/>
+          <w:i/>
+          <w:color w:val="444488"/>
         </w:rPr>
-        <w:t>La calificación final se calcula como: (Nota Documento × Peso%) + (Nota Sustentación × Peso%). Los pesos por defecto son 70% documento y 30% sustentación.</w:t>
-      </w:r>
-    </w:p>
-    <w:p>
-      <w:pPr>
-        <w:pStyle w:val="Heading2"/>
-      </w:pPr>
-      <w:r>
-        <w:rPr>
-          <w:color w:val="333333"/>
-        </w:rPr>
-        <w:t>¿Qué hago si no puedo acceder?</w:t>
+        <w:t>ℹ️  Los pesos por defecto son 70% documento y 30% sustentación. El administrador puede ajustar estos valores por programa.</w:t>
       </w:r>
     </w:p>
     <w:p>
       <w:r>
-        <w:rPr>
-          <w:b w:val="0"/>
-        </w:rPr>
-        <w:t>Contacte al administrador de su programa académico para restablecer su contraseña o verificar su cuenta.</w:t>
+        <w:br w:type="page"/>
       </w:r>
     </w:p>
-    <w:sectPr>
-      <w:headerReference w:type="default" r:id="rId9"/>
-      <w:footerReference w:type="default" r:id="rId10"/>
-      <w:pgSz w:w="12240" w:h="15840"/>
-      <w:pgMar w:top="1417" w:right="1417" w:bottom="1417" w:left="1417" w:header="720" w:footer="720" w:gutter="0"/>
-      <w:cols w:space="720"/>
-      <w:docGrid w:linePitch="360"/>
-    </w:sectPr>
+    <w:p>
+      <w:pPr>
+        <w:pStyle w:val="Heading1"/>
+      </w:pPr>
+      <w:r>
+        <w:rPr>
+          <w:color w:val="C05A12"/>
+        </w:rPr>
+        <w:t>10. Enviar correcciones</w:t>
+      </w:r>
+    </w:p>
+    <w:p>
+      <w:pPr/>
+      <w:r>
+        <w:t>Si los evaluadores solicitan correcciones al documento, recibirá una notificación por correo y el evento aparecerá en su línea de tiempo. Siga estos pasos:</w:t>
+      </w:r>
+    </w:p>
+    <w:p>
+      <w:pPr>
+        <w:pStyle w:val="ListNumber"/>
+      </w:pPr>
+      <w:r>
+        <w:t>Recibirá un correo electrónico informando las correcciones solicitadas.</w:t>
+      </w:r>
+    </w:p>
+    <w:p>
+      <w:pPr>
+        <w:pStyle w:val="ListNumber"/>
+      </w:pPr>
+      <w:r>
+        <w:t>Ingrese al sistema y vaya a la línea de tiempo de su proyecto.</w:t>
+      </w:r>
+    </w:p>
+    <w:p>
+      <w:pPr>
+        <w:pStyle w:val="ListNumber"/>
+      </w:pPr>
+      <w:r>
+        <w:t>Revise las observaciones y retroalimentación de cada evaluador.</w:t>
+      </w:r>
+    </w:p>
+    <w:p>
+      <w:pPr>
+        <w:pStyle w:val="ListNumber"/>
+      </w:pPr>
+      <w:r>
+        <w:t>Prepare la versión corregida de su documento.</w:t>
+      </w:r>
+    </w:p>
+    <w:p>
+      <w:pPr>
+        <w:pStyle w:val="ListNumber"/>
+      </w:pPr>
+      <w:r>
+        <w:t>En la sección "Enviar correcciones" del timeline:</w:t>
+      </w:r>
+    </w:p>
+    <w:p>
+      <w:pPr>
+        <w:pStyle w:val="ListBullet"/>
+      </w:pPr>
+      <w:r>
+        <w:t>Escriba un comentario explicando brevemente los cambios realizados.</w:t>
+      </w:r>
+    </w:p>
+    <w:p>
+      <w:pPr>
+        <w:pStyle w:val="ListBullet"/>
+      </w:pPr>
+      <w:r>
+        <w:t>Adjunte el documento corregido (PDF o DOCX).</w:t>
+      </w:r>
+    </w:p>
+    <w:p>
+      <w:pPr>
+        <w:pStyle w:val="ListBullet"/>
+      </w:pPr>
+      <w:r>
+        <w:t>Puede adjuntar archivos adicionales si es necesario.</w:t>
+      </w:r>
+    </w:p>
+    <w:p>
+      <w:pPr>
+        <w:pStyle w:val="ListNumber"/>
+      </w:pPr>
+      <w:r>
+        <w:t>Haga clic en "Enviar revisión".</w:t>
+      </w:r>
+    </w:p>
+    <w:p>
+      <w:pPr>
+        <w:pStyle w:val="ListNumber"/>
+      </w:pPr>
+      <w:r>
+        <w:t>El sistema incrementará automáticamente la ronda de revisión.</w:t>
+      </w:r>
+    </w:p>
+    <w:p>
+      <w:pPr>
+        <w:pStyle w:val="ListNumber"/>
+      </w:pPr>
+      <w:r>
+        <w:t>Los evaluadores recibirán una notificación para re-evaluar.</w:t>
+      </w:r>
+    </w:p>
+    <w:p/>
+    <w:p>
+      <w:pPr/>
+      <w:r>
+        <w:rPr>
+          <w:i/>
+          <w:color w:val="444488"/>
+        </w:rPr>
+        <w:t>ℹ️  Puede haber múltiples rondas de corrección. Cada ronda queda registrada en la línea de tiempo.</w:t>
+      </w:r>
+    </w:p>
+    <w:p>
+      <w:r>
+        <w:br w:type="page"/>
+      </w:r>
+    </w:p>
+    <w:p>
+      <w:pPr>
+        <w:pStyle w:val="Heading1"/>
+      </w:pPr>
+      <w:r>
+        <w:rPr>
+          <w:color w:val="C05A12"/>
+        </w:rPr>
+        <w:t>11. Firma de documentos</w:t>
+      </w:r>
+    </w:p>
+    <w:p>
+      <w:pPr/>
+      <w:r>
+        <w:t>Al finalizar el proceso de evaluación y sustentación, se generará un acta que debe ser firmada digitalmente por todos los participantes.</w:t>
+      </w:r>
+    </w:p>
+    <w:p/>
+    <w:p>
+      <w:pPr>
+        <w:pStyle w:val="Heading2"/>
+      </w:pPr>
+      <w:r>
+        <w:t>Proceso de firma del acta</w:t>
+      </w:r>
+    </w:p>
+    <w:p>
+      <w:pPr>
+        <w:pStyle w:val="ListNumber"/>
+      </w:pPr>
+      <w:r>
+        <w:t>Recibirá un correo electrónico con un enlace único e intransferible de firma.</w:t>
+      </w:r>
+    </w:p>
+    <w:p>
+      <w:pPr>
+        <w:pStyle w:val="ListNumber"/>
+      </w:pPr>
+      <w:r>
+        <w:t>Haga clic en el enlace (no requiere iniciar sesión nuevamente).</w:t>
+      </w:r>
+    </w:p>
+    <w:p>
+      <w:pPr>
+        <w:pStyle w:val="ListNumber"/>
+      </w:pPr>
+      <w:r>
+        <w:t>En la página de firma, revise la información del proyecto y el acta.</w:t>
+      </w:r>
+    </w:p>
+    <w:p>
+      <w:pPr>
+        <w:pStyle w:val="ListNumber"/>
+      </w:pPr>
+      <w:r>
+        <w:t>Haga clic en "Descargar PDF" para revisar el documento completo antes de firmar.</w:t>
+      </w:r>
+    </w:p>
+    <w:p>
+      <w:pPr>
+        <w:pStyle w:val="ListNumber"/>
+      </w:pPr>
+      <w:r>
+        <w:t>Elija un método de firma:</w:t>
+      </w:r>
+    </w:p>
+    <w:p>
+      <w:pPr>
+        <w:pStyle w:val="ListBullet"/>
+      </w:pPr>
+      <w:r>
+        <w:t>Dibujar: Use el mouse o pantalla táctil para trazar su firma.</w:t>
+      </w:r>
+    </w:p>
+    <w:p>
+      <w:pPr>
+        <w:pStyle w:val="ListBullet"/>
+      </w:pPr>
+      <w:r>
+        <w:t>Subir imagen: Cargue una imagen PNG/JPG de su firma escaneada.</w:t>
+      </w:r>
+    </w:p>
+    <w:p>
+      <w:pPr>
+        <w:pStyle w:val="ListNumber"/>
+      </w:pPr>
+      <w:r>
+        <w:t>Haga clic en "Enviar firma".</w:t>
+      </w:r>
+    </w:p>
+    <w:p>
+      <w:pPr>
+        <w:pStyle w:val="ListNumber"/>
+      </w:pPr>
+      <w:r>
+        <w:t>Será redirigido a una página de confirmación. El proceso ha concluido.</w:t>
+      </w:r>
+    </w:p>
+    <w:p/>
+    <w:p>
+      <w:pPr/>
+      <w:r>
+        <w:rPr>
+          <w:i/>
+          <w:color w:val="444488"/>
+        </w:rPr>
+        <w:t>ℹ️  El enlace de firma es único y personal. No lo comparta con otras personas.</w:t>
+      </w:r>
+    </w:p>
+    <w:p>
+      <w:pPr/>
+      <w:r>
+        <w:rPr>
+          <w:i/>
+          <w:color w:val="444488"/>
+        </w:rPr>
+        <w:t>⚠️  Una vez enviada la firma, no puede modificarse.</w:t>
+      </w:r>
+    </w:p>
+    <w:p/>
+    <w:p>
+      <w:pPr>
+        <w:pStyle w:val="Heading2"/>
+      </w:pPr>
+      <w:r>
+        <w:t>Carta meritoria</w:t>
+      </w:r>
+    </w:p>
+    <w:p>
+      <w:pPr/>
+      <w:r>
+        <w:t>Si su proyecto obtuvo una calificación meritoria (≥ 4.8 / 5.0), recibirá un enlace adicional para firmar la carta de graduación meritoria. El proceso es idéntico al de la firma del acta.</w:t>
+      </w:r>
+    </w:p>
+    <w:p>
+      <w:r>
+        <w:br w:type="page"/>
+      </w:r>
+    </w:p>
+    <w:p>
+      <w:pPr>
+        <w:pStyle w:val="Heading1"/>
+      </w:pPr>
+      <w:r>
+        <w:rPr>
+          <w:color w:val="C05A12"/>
+        </w:rPr>
+        <w:t>12. Preguntas frecuentes</w:t>
+      </w:r>
+    </w:p>
+    <w:p>
+      <w:pPr>
+        <w:pStyle w:val="Heading2"/>
+      </w:pPr>
+      <w:r>
+        <w:t>¿Qué hago si no recibí el correo con mi contraseña al registrarme?</w:t>
+      </w:r>
+    </w:p>
+    <w:p>
+      <w:pPr/>
+      <w:r>
+        <w:t>Revise la carpeta de spam o correo no deseado. Si tampoco está ahí, use la opción "¿Olvidaste tu contraseña?" en la pantalla de inicio de sesión para generar una nueva contraseña. Asegúrese de ingresar la misma cédula y correo con los que se registró.</w:t>
+      </w:r>
+    </w:p>
+    <w:p>
+      <w:pPr>
+        <w:pStyle w:val="Heading2"/>
+      </w:pPr>
+      <w:r>
+        <w:t>¿Puedo editar mi proyecto después de enviarlo a evaluación?</w:t>
+      </w:r>
+    </w:p>
+    <w:p>
+      <w:pPr/>
+      <w:r>
+        <w:t>No. Una vez enviado a evaluación, el proyecto queda en modo solo lectura. Asegúrese de que toda la información y archivos estén correctos antes de enviar.</w:t>
+      </w:r>
+    </w:p>
+    <w:p>
+      <w:pPr>
+        <w:pStyle w:val="Heading2"/>
+      </w:pPr>
+      <w:r>
+        <w:t>¿Cuántos archivos puedo subir?</w:t>
+      </w:r>
+    </w:p>
+    <w:p>
+      <w:pPr/>
+      <w:r>
+        <w:t>Puede subir el documento de tesis y un archivo de aval. Adicionalmente, al enviar correcciones puede adjuntar múltiples archivos. El tamaño máximo es 100 MB por archivo. Formatos permitidos: PDF, DOC, DOCX, JPG, PNG, GIF.</w:t>
+      </w:r>
+    </w:p>
+    <w:p>
+      <w:pPr>
+        <w:pStyle w:val="Heading2"/>
+      </w:pPr>
+      <w:r>
+        <w:t>¿Cómo sé si mis evaluadores ya revisaron mi proyecto?</w:t>
+      </w:r>
+    </w:p>
+    <w:p>
+      <w:pPr/>
+      <w:r>
+        <w:t>Revise la línea de tiempo de su proyecto. Cuando un evaluador emita su concepto, aparecerá un nuevo evento con la retroalimentación correspondiente. También recibirá una notificación por correo electrónico.</w:t>
+      </w:r>
+    </w:p>
+    <w:p>
+      <w:pPr>
+        <w:pStyle w:val="Heading2"/>
+      </w:pPr>
+      <w:r>
+        <w:t>¿Qué significan los estados del proyecto?</w:t>
+      </w:r>
+    </w:p>
+    <w:tbl>
+      <w:tblPr>
+        <w:tblStyle w:val="TableGrid"/>
+        <w:tblW w:type="auto" w:w="0"/>
+        <w:tblLook w:firstColumn="1" w:firstRow="1" w:lastColumn="0" w:lastRow="0" w:noHBand="0" w:noVBand="1" w:val="04A0"/>
+      </w:tblPr>
+      <w:tblGrid>
+        <w:gridCol w:w="4680"/>
+        <w:gridCol w:w="4680"/>
+      </w:tblGrid>
+      <w:tr>
+        <w:tc>
+          <w:tcPr>
+            <w:tcW w:type="dxa" w:w="4680"/>
+          </w:tcPr>
+          <w:p>
+            <w:r>
+              <w:rPr>
+                <w:b/>
+              </w:rPr>
+              <w:t>Estado</w:t>
+            </w:r>
+          </w:p>
+        </w:tc>
+        <w:tc>
+          <w:tcPr>
+            <w:tcW w:type="dxa" w:w="4680"/>
+          </w:tcPr>
+          <w:p>
+            <w:r>
+              <w:rPr>
+                <w:b/>
+              </w:rPr>
+              <w:t>Significado</w:t>
+            </w:r>
+          </w:p>
+        </w:tc>
+      </w:tr>
+      <w:tr>
+        <w:tc>
+          <w:tcPr>
+            <w:tcW w:type="dxa" w:w="4680"/>
+          </w:tcPr>
+          <w:p>
+            <w:r>
+              <w:t>Borrador</w:t>
+            </w:r>
+          </w:p>
+        </w:tc>
+        <w:tc>
+          <w:tcPr>
+            <w:tcW w:type="dxa" w:w="4680"/>
+          </w:tcPr>
+          <w:p>
+            <w:r>
+              <w:t>El proyecto fue creado pero aún no se ha enviado. Puede editarse.</w:t>
+            </w:r>
+          </w:p>
+        </w:tc>
+      </w:tr>
+      <w:tr>
+        <w:tc>
+          <w:tcPr>
+            <w:tcW w:type="dxa" w:w="4680"/>
+          </w:tcPr>
+          <w:p>
+            <w:r>
+              <w:t>Enviado</w:t>
+            </w:r>
+          </w:p>
+        </w:tc>
+        <w:tc>
+          <w:tcPr>
+            <w:tcW w:type="dxa" w:w="4680"/>
+          </w:tcPr>
+          <w:p>
+            <w:r>
+              <w:t>El proyecto fue enviado al administrador para revisión.</w:t>
+            </w:r>
+          </w:p>
+        </w:tc>
+      </w:tr>
+      <w:tr>
+        <w:tc>
+          <w:tcPr>
+            <w:tcW w:type="dxa" w:w="4680"/>
+          </w:tcPr>
+          <w:p>
+            <w:r>
+              <w:t>En revisión</w:t>
+            </w:r>
+          </w:p>
+        </w:tc>
+        <w:tc>
+          <w:tcPr>
+            <w:tcW w:type="dxa" w:w="4680"/>
+          </w:tcPr>
+          <w:p>
+            <w:r>
+              <w:t>El administrador está revisando la documentación.</w:t>
+            </w:r>
+          </w:p>
+        </w:tc>
+      </w:tr>
+      <w:tr>
+        <w:tc>
+          <w:tcPr>
+            <w:tcW w:type="dxa" w:w="4680"/>
+          </w:tcPr>
+          <w:p>
+            <w:r>
+              <w:t>En evaluación</w:t>
+            </w:r>
+          </w:p>
+        </w:tc>
+        <w:tc>
+          <w:tcPr>
+            <w:tcW w:type="dxa" w:w="4680"/>
+          </w:tcPr>
+          <w:p>
+            <w:r>
+              <w:t>Los evaluadores académicos están revisando el documento.</w:t>
+            </w:r>
+          </w:p>
+        </w:tc>
+      </w:tr>
+      <w:tr>
+        <w:tc>
+          <w:tcPr>
+            <w:tcW w:type="dxa" w:w="4680"/>
+          </w:tcPr>
+          <w:p>
+            <w:r>
+              <w:t>Correcciones</w:t>
+            </w:r>
+          </w:p>
+        </w:tc>
+        <w:tc>
+          <w:tcPr>
+            <w:tcW w:type="dxa" w:w="4680"/>
+          </w:tcPr>
+          <w:p>
+            <w:r>
+              <w:t>Se solicitaron correcciones. Debe enviar una versión revisada.</w:t>
+            </w:r>
+          </w:p>
+        </w:tc>
+      </w:tr>
+      <w:tr>
+        <w:tc>
+          <w:tcPr>
+            <w:tcW w:type="dxa" w:w="4680"/>
+          </w:tcPr>
+          <w:p>
+            <w:r>
+              <w:t>Aprobado</w:t>
+            </w:r>
+          </w:p>
+        </w:tc>
+        <w:tc>
+          <w:tcPr>
+            <w:tcW w:type="dxa" w:w="4680"/>
+          </w:tcPr>
+          <w:p>
+            <w:r>
+              <w:t>El proyecto fue aprobado. Puede proceder a sustentación.</w:t>
+            </w:r>
+          </w:p>
+        </w:tc>
+      </w:tr>
+      <w:tr>
+        <w:tc>
+          <w:tcPr>
+            <w:tcW w:type="dxa" w:w="4680"/>
+          </w:tcPr>
+          <w:p>
+            <w:r>
+              <w:t>Sustentación</w:t>
+            </w:r>
+          </w:p>
+        </w:tc>
+        <w:tc>
+          <w:tcPr>
+            <w:tcW w:type="dxa" w:w="4680"/>
+          </w:tcPr>
+          <w:p>
+            <w:r>
+              <w:t>La sustentación ha sido programada o está en proceso.</w:t>
+            </w:r>
+          </w:p>
+        </w:tc>
+      </w:tr>
+      <w:tr>
+        <w:tc>
+          <w:tcPr>
+            <w:tcW w:type="dxa" w:w="4680"/>
+          </w:tcPr>
+          <w:p>
+            <w:r>
+              <w:t>Finalizado</w:t>
+            </w:r>
+          </w:p>
+        </w:tc>
+        <w:tc>
+          <w:tcPr>
+            <w:tcW w:type="dxa" w:w="4680"/>
+          </w:tcPr>
+          <w:p>
+            <w:r>
+              <w:t>Todo el proceso ha concluido incluyendo la firma del acta.</w:t>
+            </w:r>
+          </w:p>
+        </w:tc>
+      </w:tr>
+    </w:tbl>
+    <w:p>
+      <w:pPr>
+        <w:pStyle w:val="Heading2"/>
+      </w:pPr>
+      <w:r>
+        <w:t>¿Puedo iniciar sesión con mi cédula en lugar del correo?</w:t>
+      </w:r>
+    </w:p>
+    <w:p>
+      <w:pPr/>
+      <w:r>
+        <w:t>Sí. El sistema acepta las siguientes formas de identificación en el campo de usuario: correo institucional, código estudiantil o número de cédula.</w:t>
+      </w:r>
+    </w:p>
+    <w:p>
+      <w:pPr>
+        <w:pStyle w:val="Heading2"/>
+      </w:pPr>
+      <w:r>
+        <w:t>¿Qué hago si no puedo acceder al sistema y no recuerdo mi cédula registrada?</w:t>
+      </w:r>
+    </w:p>
+    <w:p>
+      <w:pPr/>
+      <w:r>
+        <w:t>Contacte al administrador de su programa académico. Él podrá verificar su cuenta y ayudarle a recuperar el acceso o actualizar su información.</w:t>
+      </w:r>
+    </w:p>
+    <w:p>
+      <w:pPr>
+        <w:pStyle w:val="Heading2"/>
+      </w:pPr>
+      <w:r>
+        <w:t>¿Cómo cambio mi contraseña una vez dentro del sistema?</w:t>
+      </w:r>
+    </w:p>
+    <w:p>
+      <w:pPr/>
+      <w:r>
+        <w:t>Diríjase a su perfil de usuario (icono de usuario en la esquina superior) y busque la opción "Cambiar contraseña". Ingrese su contraseña actual y la nueva contraseña deseada.</w:t>
+      </w:r>
+    </w:p>
+    <w:sectPr/>
   </w:body>
 </w:document>
 </file>

</xml_diff>